<commit_message>
vault backup: 2026-07-12 01:23:03
</commit_message>
<xml_diff>
--- a/走在前列/永庆坊传统文化街区活化实践报告.docx
+++ b/走在前列/永庆坊传统文化街区活化实践报告.docx
@@ -17,7 +17,7 @@
     </w:p>
     <w:p>
       <w:pPr>
-        <w:spacing w:before="640" w:after="160"/>
+        <w:spacing w:after="160" w:line="240" w:lineRule="auto"/>
         <w:jc w:val="center"/>
       </w:pPr>
       <w:r>
@@ -72,7 +72,40 @@
           <w:sz w:val="32"/>
           <w:lang w:eastAsia="zh-CN"/>
         </w:rPr>
-        <w:t xml:space="preserve">实践活动      </w:t>
+        <w:t>实践活动</w:t>
+      </w:r>
+      <w:r>
+        <w:rPr>
+          <w:rFonts w:ascii="微软雅黑" w:eastAsia="微软雅黑" w:hAnsi="微软雅黑"/>
+          <w:b/>
+          <w:bCs/>
+          <w:color w:val="auto"/>
+          <w:sz w:val="32"/>
+          <w:lang w:eastAsia="zh-CN"/>
+        </w:rPr>
+        <w:tab/>
+      </w:r>
+      <w:r>
+        <w:rPr>
+          <w:rFonts w:ascii="微软雅黑" w:eastAsia="微软雅黑" w:hAnsi="微软雅黑"/>
+          <w:b/>
+          <w:bCs/>
+          <w:color w:val="auto"/>
+          <w:sz w:val="32"/>
+          <w:lang w:eastAsia="zh-CN"/>
+        </w:rPr>
+        <w:tab/>
+      </w:r>
+      <w:r>
+        <w:rPr>
+          <w:rFonts w:ascii="微软雅黑" w:eastAsia="微软雅黑" w:hAnsi="微软雅黑" w:hint="eastAsia"/>
+          <w:b/>
+          <w:bCs/>
+          <w:color w:val="auto"/>
+          <w:sz w:val="32"/>
+          <w:lang w:eastAsia="zh-CN"/>
+        </w:rPr>
+        <w:t xml:space="preserve"> </w:t>
       </w:r>
     </w:p>
     <w:p>
@@ -188,16 +221,6 @@
             </w:pPr>
             <w:r>
               <w:rPr>
-                <w:rFonts w:ascii="楷体" w:eastAsia="楷体" w:hAnsi="楷体"/>
-                <w:b/>
-                <w:bCs/>
-                <w:sz w:val="36"/>
-                <w:szCs w:val="44"/>
-              </w:rPr>
-              <w:t>______</w:t>
-            </w:r>
-            <w:r>
-              <w:rPr>
                 <w:rFonts w:ascii="楷体" w:eastAsia="楷体" w:hAnsi="楷体" w:hint="eastAsia"/>
                 <w:b/>
                 <w:bCs/>
@@ -206,16 +229,6 @@
                 <w:lang w:eastAsia="zh-CN"/>
               </w:rPr>
               <w:t>黄宁</w:t>
-            </w:r>
-            <w:r>
-              <w:rPr>
-                <w:rFonts w:ascii="楷体" w:eastAsia="楷体" w:hAnsi="楷体"/>
-                <w:b/>
-                <w:bCs/>
-                <w:sz w:val="36"/>
-                <w:szCs w:val="44"/>
-              </w:rPr>
-              <w:t>_____</w:t>
             </w:r>
           </w:p>
         </w:tc>
@@ -576,6 +589,7 @@
         <w:pBdr>
           <w:bottom w:val="single" w:sz="8" w:space="4" w:color="7086E8"/>
         </w:pBdr>
+        <w:spacing w:line="240" w:lineRule="auto"/>
         <w:rPr>
           <w:lang w:eastAsia="zh-CN"/>
         </w:rPr>
@@ -708,168 +722,6 @@
         <w:t>文旅融合</w:t>
       </w:r>
       <w:proofErr w:type="gramEnd"/>
-    </w:p>
-    <w:p>
-      <w:pPr>
-        <w:pStyle w:val="1"/>
-        <w:pBdr>
-          <w:bottom w:val="single" w:sz="8" w:space="4" w:color="7086E8"/>
-        </w:pBdr>
-        <w:rPr>
-          <w:lang w:eastAsia="zh-CN"/>
-        </w:rPr>
-      </w:pPr>
-      <w:r>
-        <w:rPr>
-          <w:lang w:eastAsia="zh-CN"/>
-        </w:rPr>
-        <w:t>一、实践背景</w:t>
-      </w:r>
-    </w:p>
-    <w:p>
-      <w:pPr>
-        <w:ind w:firstLine="480"/>
-        <w:rPr>
-          <w:lang w:eastAsia="zh-CN"/>
-        </w:rPr>
-      </w:pPr>
-      <w:r>
-        <w:rPr>
-          <w:lang w:eastAsia="zh-CN"/>
-        </w:rPr>
-        <w:t>岭南文化是中华优秀传统文化的重要组成部分，</w:t>
-      </w:r>
-      <w:r>
-        <w:rPr>
-          <w:lang w:eastAsia="zh-CN"/>
-        </w:rPr>
-        <w:t>也是广东建设文化强省、增强文化自信的重要资源。随着城市化进程推进，传统街区一方面面临建筑老化、公共设施不足和传统业态衰退，另一方面也获得了城市更新、文化旅游与数字传播带来的新机会。如何在改善环境的同时保存城市记忆，已成为广州老城治理的重要课题。</w:t>
-      </w:r>
-    </w:p>
-    <w:p>
-      <w:pPr>
-        <w:ind w:firstLine="480"/>
-        <w:rPr>
-          <w:lang w:eastAsia="zh-CN"/>
-        </w:rPr>
-      </w:pPr>
-      <w:r>
-        <w:rPr>
-          <w:lang w:eastAsia="zh-CN"/>
-        </w:rPr>
-        <w:t>永庆坊所在的恩宁路片区保留了</w:t>
-      </w:r>
-      <w:r>
-        <w:rPr>
-          <w:rFonts w:hint="eastAsia"/>
-          <w:b/>
-          <w:bCs/>
-          <w:lang w:eastAsia="zh-CN"/>
-        </w:rPr>
-        <w:t>现存最</w:t>
-      </w:r>
-      <w:r>
-        <w:rPr>
-          <w:b/>
-          <w:bCs/>
-          <w:lang w:eastAsia="zh-CN"/>
-        </w:rPr>
-        <w:t>完整的骑楼街巷</w:t>
-      </w:r>
-      <w:r>
-        <w:rPr>
-          <w:lang w:eastAsia="zh-CN"/>
-        </w:rPr>
-        <w:t>、粤剧文化资源和社区生活痕迹。改造没有把街区处理成封闭的静态展馆，而是通过建筑修缮、功能置换、公共空间营造和文化项目导入，使其成为兼具参观、消费、休闲与文化教育功能的开放街区。本次实践据此考察广东在文化保护与城市发展之间寻找平衡的具体方式。</w:t>
-      </w:r>
-    </w:p>
-    <w:p>
-      <w:pPr>
-        <w:pStyle w:val="1"/>
-        <w:pBdr>
-          <w:bottom w:val="single" w:sz="8" w:space="4" w:color="7086E8"/>
-        </w:pBdr>
-        <w:rPr>
-          <w:lang w:eastAsia="zh-CN"/>
-        </w:rPr>
-      </w:pPr>
-      <w:r>
-        <w:rPr>
-          <w:lang w:eastAsia="zh-CN"/>
-        </w:rPr>
-        <w:t>二、实践目的</w:t>
-      </w:r>
-    </w:p>
-    <w:p>
-      <w:pPr>
-        <w:ind w:firstLine="480"/>
-        <w:rPr>
-          <w:lang w:eastAsia="zh-CN"/>
-        </w:rPr>
-      </w:pPr>
-      <w:r>
-        <w:rPr>
-          <w:lang w:eastAsia="zh-CN"/>
-        </w:rPr>
-        <w:t>第一，观察骑楼、传统街巷和历史建筑的保护情况，理解“微改造”区别于大拆大建的空间逻辑。</w:t>
-      </w:r>
-    </w:p>
-    <w:p>
-      <w:pPr>
-        <w:ind w:firstLine="480"/>
-        <w:rPr>
-          <w:lang w:eastAsia="zh-CN"/>
-        </w:rPr>
-      </w:pPr>
-      <w:r>
-        <w:rPr>
-          <w:lang w:eastAsia="zh-CN"/>
-        </w:rPr>
-        <w:lastRenderedPageBreak/>
-        <w:t>第二，考察粤剧、传统工艺及岭南视觉元素如何进入展览、商业和公共空间，分析传统文化的当代表达。</w:t>
-      </w:r>
-    </w:p>
-    <w:p>
-      <w:pPr>
-        <w:ind w:firstLine="480"/>
-        <w:rPr>
-          <w:lang w:eastAsia="zh-CN"/>
-        </w:rPr>
-      </w:pPr>
-      <w:r>
-        <w:rPr>
-          <w:lang w:eastAsia="zh-CN"/>
-        </w:rPr>
-        <w:t>第三，评估</w:t>
-      </w:r>
-      <w:proofErr w:type="gramStart"/>
-      <w:r>
-        <w:rPr>
-          <w:lang w:eastAsia="zh-CN"/>
-        </w:rPr>
-        <w:t>文旅发展</w:t>
-      </w:r>
-      <w:proofErr w:type="gramEnd"/>
-      <w:r>
-        <w:rPr>
-          <w:lang w:eastAsia="zh-CN"/>
-        </w:rPr>
-        <w:t>带来的公共环境改善与经济活力，同时识别文化表层化、商业同质化等风险。</w:t>
-      </w:r>
-    </w:p>
-    <w:p>
-      <w:pPr>
-        <w:ind w:firstLine="480"/>
-        <w:rPr>
-          <w:lang w:eastAsia="zh-CN"/>
-        </w:rPr>
-      </w:pPr>
-      <w:r>
-        <w:rPr>
-          <w:lang w:eastAsia="zh-CN"/>
-        </w:rPr>
-        <w:t>第四，从青年视角思考文化传播、志愿服务和数字记录可以发挥的作用。</w:t>
-      </w:r>
     </w:p>
     <w:p>
       <w:pPr>
@@ -886,61 +738,270 @@
         <w:rPr>
           <w:lang w:eastAsia="zh-CN"/>
         </w:rPr>
-        <w:t>三、实践时间、地点与调查方法</w:t>
+        <w:t>一、实践背景</w:t>
       </w:r>
     </w:p>
     <w:p>
       <w:pPr>
         <w:ind w:firstLine="480"/>
         <w:rPr>
-          <w:rFonts w:hint="eastAsia"/>
-          <w:lang w:eastAsia="zh-CN"/>
-        </w:rPr>
-      </w:pPr>
-      <w:r>
-        <w:rPr>
-          <w:lang w:eastAsia="zh-CN"/>
-        </w:rPr>
-        <w:t>实践地点为广州市</w:t>
-      </w:r>
-      <w:proofErr w:type="gramStart"/>
-      <w:r>
-        <w:rPr>
-          <w:lang w:eastAsia="zh-CN"/>
-        </w:rPr>
-        <w:t>荔</w:t>
-      </w:r>
-      <w:proofErr w:type="gramEnd"/>
-      <w:r>
-        <w:rPr>
-          <w:lang w:eastAsia="zh-CN"/>
-        </w:rPr>
-        <w:t>湾区永庆坊及恩宁路历史文化街区，路线依次覆盖</w:t>
-      </w:r>
+          <w:lang w:eastAsia="zh-CN"/>
+        </w:rPr>
+      </w:pPr>
       <w:r>
         <w:rPr>
           <w:b/>
           <w:bCs/>
           <w:lang w:eastAsia="zh-CN"/>
         </w:rPr>
-        <w:t>骑楼街道、粤剧艺术博物馆周边、</w:t>
-      </w:r>
-      <w:proofErr w:type="gramStart"/>
-      <w:r>
-        <w:rPr>
+        <w:t>岭南文化</w:t>
+      </w:r>
+      <w:r>
+        <w:rPr>
+          <w:lang w:eastAsia="zh-CN"/>
+        </w:rPr>
+        <w:t>是中华优秀传统文化的重要组成部分，</w:t>
+      </w:r>
+      <w:r>
+        <w:rPr>
+          <w:lang w:eastAsia="zh-CN"/>
+        </w:rPr>
+        <w:t>也是广东建设文化强省、增强文化自信的重要资源。随着城市化进程推进，传统街区一方面面临建筑老化、公共设施不足和传统业态衰退，另一方面也获得了城市更新、文化旅游与数字传播带来的新机会。如何在改善环境的同时保存城市记忆，已成为广州老城治理的重要课题。</w:t>
+      </w:r>
+    </w:p>
+    <w:p>
+      <w:pPr>
+        <w:ind w:firstLine="480"/>
+        <w:rPr>
+          <w:lang w:eastAsia="zh-CN"/>
+        </w:rPr>
+      </w:pPr>
+      <w:r>
+        <w:rPr>
+          <w:lang w:eastAsia="zh-CN"/>
+        </w:rPr>
+        <w:t>永庆坊所在的恩宁路片区保留了</w:t>
+      </w:r>
+      <w:r>
+        <w:rPr>
+          <w:rFonts w:hint="eastAsia"/>
           <w:b/>
           <w:bCs/>
           <w:lang w:eastAsia="zh-CN"/>
         </w:rPr>
-        <w:t>非遗与商业</w:t>
-      </w:r>
-      <w:proofErr w:type="gramEnd"/>
+        <w:t>现存最</w:t>
+      </w:r>
       <w:r>
         <w:rPr>
           <w:b/>
           <w:bCs/>
           <w:lang w:eastAsia="zh-CN"/>
         </w:rPr>
+        <w:t>完整的骑楼街巷</w:t>
+      </w:r>
+      <w:r>
+        <w:rPr>
+          <w:lang w:eastAsia="zh-CN"/>
+        </w:rPr>
+        <w:t>、粤剧文化资源和社区生活痕迹。</w:t>
+      </w:r>
+      <w:r>
+        <w:rPr>
+          <w:rFonts w:hint="eastAsia"/>
+          <w:lang w:eastAsia="zh-CN"/>
+        </w:rPr>
+        <w:t>现代化</w:t>
+      </w:r>
+      <w:r>
+        <w:rPr>
+          <w:lang w:eastAsia="zh-CN"/>
+        </w:rPr>
+        <w:t>改造通过建筑修缮、功能置换、公共空间营造和文化项目导入，使其成为兼具参观、消费、休闲与文化教育功能的开放街区。本次实践据此考察广东在文化保护与城市发展之间寻找平衡的具体方式。</w:t>
+      </w:r>
+    </w:p>
+    <w:p>
+      <w:pPr>
+        <w:pStyle w:val="1"/>
+        <w:pBdr>
+          <w:bottom w:val="single" w:sz="8" w:space="4" w:color="7086E8"/>
+        </w:pBdr>
+        <w:spacing w:line="240" w:lineRule="auto"/>
+        <w:rPr>
+          <w:lang w:eastAsia="zh-CN"/>
+        </w:rPr>
+      </w:pPr>
+      <w:r>
+        <w:rPr>
+          <w:lang w:eastAsia="zh-CN"/>
+        </w:rPr>
+        <w:t>二、实践目的</w:t>
+      </w:r>
+    </w:p>
+    <w:p>
+      <w:pPr>
+        <w:ind w:firstLine="480"/>
+        <w:rPr>
+          <w:rFonts w:hint="eastAsia"/>
+          <w:lang w:eastAsia="zh-CN"/>
+        </w:rPr>
+      </w:pPr>
+      <w:r>
+        <w:rPr>
+          <w:lang w:eastAsia="zh-CN"/>
+        </w:rPr>
+        <w:t>第一，观察骑楼、传统街巷和历史建筑的保护情况，</w:t>
+      </w:r>
+      <w:r>
+        <w:rPr>
+          <w:rFonts w:hint="eastAsia"/>
+          <w:lang w:eastAsia="zh-CN"/>
+        </w:rPr>
+        <w:t>体会什么是微改造，以及传统建筑风格如何融合现代商业发展。</w:t>
+      </w:r>
+    </w:p>
+    <w:p>
+      <w:pPr>
+        <w:ind w:firstLine="480"/>
+        <w:rPr>
+          <w:lang w:eastAsia="zh-CN"/>
+        </w:rPr>
+      </w:pPr>
+      <w:r>
+        <w:rPr>
+          <w:lang w:eastAsia="zh-CN"/>
+        </w:rPr>
+        <w:t>第二，考察粤剧、传统工艺及岭南视觉元素如何进入展览、商业和公共空间，分析传统文化的当代表达。</w:t>
+      </w:r>
+    </w:p>
+    <w:p>
+      <w:pPr>
+        <w:ind w:firstLine="480"/>
+        <w:rPr>
+          <w:lang w:eastAsia="zh-CN"/>
+        </w:rPr>
+      </w:pPr>
+      <w:r>
+        <w:rPr>
+          <w:lang w:eastAsia="zh-CN"/>
+        </w:rPr>
+        <w:lastRenderedPageBreak/>
+        <w:t>第三，评估</w:t>
+      </w:r>
+      <w:proofErr w:type="gramStart"/>
+      <w:r>
+        <w:rPr>
+          <w:lang w:eastAsia="zh-CN"/>
+        </w:rPr>
+        <w:t>文旅发展</w:t>
+      </w:r>
+      <w:proofErr w:type="gramEnd"/>
+      <w:r>
+        <w:rPr>
+          <w:lang w:eastAsia="zh-CN"/>
+        </w:rPr>
+        <w:t>带来的公共环境改善与经济活力，同时识别文化表层化、商业同质化等风险。</w:t>
+      </w:r>
+    </w:p>
+    <w:p>
+      <w:pPr>
+        <w:ind w:firstLine="480"/>
+        <w:rPr>
+          <w:lang w:eastAsia="zh-CN"/>
+        </w:rPr>
+      </w:pPr>
+      <w:r>
+        <w:rPr>
+          <w:lang w:eastAsia="zh-CN"/>
+        </w:rPr>
+        <w:t>第四，从青年视角思考文化传播、志愿服务和数字记录可以发挥的作用。</w:t>
+      </w:r>
+    </w:p>
+    <w:p>
+      <w:pPr>
+        <w:pStyle w:val="1"/>
+        <w:pBdr>
+          <w:bottom w:val="single" w:sz="8" w:space="4" w:color="7086E8"/>
+        </w:pBdr>
+        <w:spacing w:line="240" w:lineRule="auto"/>
+        <w:rPr>
+          <w:lang w:eastAsia="zh-CN"/>
+        </w:rPr>
+      </w:pPr>
+      <w:r>
+        <w:rPr>
+          <w:lang w:eastAsia="zh-CN"/>
+        </w:rPr>
+        <w:t>三、实践时间、地点与调查方法</w:t>
+      </w:r>
+    </w:p>
+    <w:p>
+      <w:pPr>
+        <w:ind w:firstLine="480"/>
+        <w:rPr>
+          <w:rFonts w:hint="eastAsia"/>
+          <w:lang w:eastAsia="zh-CN"/>
+        </w:rPr>
+      </w:pPr>
+      <w:r>
+        <w:rPr>
+          <w:rFonts w:hint="eastAsia"/>
+          <w:lang w:eastAsia="zh-CN"/>
+        </w:rPr>
+        <w:t>实践时间：2026.5.2——5.10</w:t>
+      </w:r>
+    </w:p>
+    <w:p>
+      <w:pPr>
+        <w:ind w:firstLine="480"/>
+        <w:rPr>
+          <w:rFonts w:hint="eastAsia"/>
+          <w:lang w:eastAsia="zh-CN"/>
+        </w:rPr>
+      </w:pPr>
+      <w:r>
+        <w:rPr>
+          <w:lang w:eastAsia="zh-CN"/>
+        </w:rPr>
+        <w:t>实践地点为广州市</w:t>
+      </w:r>
+      <w:proofErr w:type="gramStart"/>
+      <w:r>
+        <w:rPr>
+          <w:lang w:eastAsia="zh-CN"/>
+        </w:rPr>
+        <w:t>荔</w:t>
+      </w:r>
+      <w:proofErr w:type="gramEnd"/>
+      <w:r>
+        <w:rPr>
+          <w:lang w:eastAsia="zh-CN"/>
+        </w:rPr>
+        <w:t>湾区永庆坊及恩宁路历史文化街区，路线依次覆盖</w:t>
+      </w:r>
+      <w:r>
+        <w:rPr>
+          <w:b/>
+          <w:bCs/>
+          <w:lang w:eastAsia="zh-CN"/>
+        </w:rPr>
+        <w:t>骑楼街道、粤剧艺术博物馆周边、</w:t>
+      </w:r>
+      <w:proofErr w:type="gramStart"/>
+      <w:r>
+        <w:rPr>
+          <w:b/>
+          <w:bCs/>
+          <w:lang w:eastAsia="zh-CN"/>
+        </w:rPr>
+        <w:t>非遗与商业</w:t>
+      </w:r>
+      <w:proofErr w:type="gramEnd"/>
+      <w:r>
+        <w:rPr>
+          <w:b/>
+          <w:bCs/>
+          <w:lang w:eastAsia="zh-CN"/>
+        </w:rPr>
         <w:t>空间以及滨河公共空间</w:t>
       </w:r>
       <w:r>
@@ -954,14 +1015,15 @@
       <w:pPr>
         <w:ind w:firstLine="480"/>
         <w:rPr>
-          <w:lang w:eastAsia="zh-CN"/>
-        </w:rPr>
-      </w:pPr>
-      <w:r>
-        <w:rPr>
-          <w:lang w:eastAsia="zh-CN"/>
-        </w:rPr>
-        <w:t>本次报告采用现场图片观察、空间路线记录和资料分析相结合的方法。图片用于识别建筑立面、街道尺度、文化符号、游客活动与水岸空间；</w:t>
+          <w:rFonts w:hint="eastAsia"/>
+          <w:lang w:eastAsia="zh-CN"/>
+        </w:rPr>
+      </w:pPr>
+      <w:r>
+        <w:rPr>
+          <w:lang w:eastAsia="zh-CN"/>
+        </w:rPr>
+        <w:t>本次报告采用现场图片观察、空间路线记录和资料分析相结合的方法。</w:t>
       </w:r>
       <w:r>
         <w:rPr>
@@ -980,10 +1042,10 @@
           <w:noProof/>
         </w:rPr>
         <w:drawing>
-          <wp:inline distT="0" distB="0" distL="0" distR="0" wp14:anchorId="2C85EADA" wp14:editId="288F87C9">
-            <wp:extent cx="5257800" cy="3933059"/>
+          <wp:inline distT="0" distB="0" distL="0" distR="0" wp14:anchorId="30F4B6DD" wp14:editId="473D5E29">
+            <wp:extent cx="6215770" cy="3778942"/>
             <wp:effectExtent l="0" t="0" r="0" b="0"/>
-            <wp:docPr id="2" name="Picture 2"/>
+            <wp:docPr id="1867850272" name="图片 9"/>
             <wp:cNvGraphicFramePr>
               <a:graphicFrameLocks xmlns:a="http://schemas.openxmlformats.org/drawingml/2006/main" noChangeAspect="1"/>
             </wp:cNvGraphicFramePr>
@@ -991,23 +1053,36 @@
               <a:graphicData uri="http://schemas.openxmlformats.org/drawingml/2006/picture">
                 <pic:pic xmlns:pic="http://schemas.openxmlformats.org/drawingml/2006/picture">
                   <pic:nvPicPr>
-                    <pic:cNvPr id="0" name="p30.jpg"/>
-                    <pic:cNvPicPr/>
+                    <pic:cNvPr id="0" name="Picture 9"/>
+                    <pic:cNvPicPr>
+                      <a:picLocks noChangeAspect="1" noChangeArrowheads="1"/>
+                    </pic:cNvPicPr>
                   </pic:nvPicPr>
                   <pic:blipFill>
-                    <a:blip r:embed="rId8"/>
+                    <a:blip r:embed="rId8">
+                      <a:extLst>
+                        <a:ext uri="{28A0092B-C50C-407E-A947-70E740481C1C}">
+                          <a14:useLocalDpi xmlns:a14="http://schemas.microsoft.com/office/drawing/2010/main" val="0"/>
+                        </a:ext>
+                      </a:extLst>
+                    </a:blip>
+                    <a:srcRect/>
                     <a:stretch>
                       <a:fillRect/>
                     </a:stretch>
                   </pic:blipFill>
-                  <pic:spPr>
+                  <pic:spPr bwMode="auto">
                     <a:xfrm>
                       <a:off x="0" y="0"/>
-                      <a:ext cx="5257800" cy="3933059"/>
+                      <a:ext cx="6224078" cy="3783993"/>
                     </a:xfrm>
                     <a:prstGeom prst="rect">
                       <a:avLst/>
                     </a:prstGeom>
+                    <a:noFill/>
+                    <a:ln>
+                      <a:noFill/>
+                    </a:ln>
                   </pic:spPr>
                 </pic:pic>
               </a:graphicData>
@@ -1029,21 +1104,14 @@
         <w:rPr>
           <w:lang w:eastAsia="zh-CN"/>
         </w:rPr>
-        <w:t>图1 永庆坊导</w:t>
-      </w:r>
-      <w:proofErr w:type="gramStart"/>
-      <w:r>
-        <w:rPr>
-          <w:lang w:eastAsia="zh-CN"/>
-        </w:rPr>
-        <w:t>览</w:t>
-      </w:r>
-      <w:proofErr w:type="gramEnd"/>
-      <w:r>
-        <w:rPr>
-          <w:lang w:eastAsia="zh-CN"/>
-        </w:rPr>
-        <w:t>图</w:t>
+        <w:t>图1 永庆坊</w:t>
+      </w:r>
+      <w:r>
+        <w:rPr>
+          <w:rFonts w:hint="eastAsia"/>
+          <w:lang w:eastAsia="zh-CN"/>
+        </w:rPr>
+        <w:t>地图电子版原图</w:t>
       </w:r>
     </w:p>
     <w:p>
@@ -1091,20 +1159,38 @@
         <w:rPr>
           <w:lang w:eastAsia="zh-CN"/>
         </w:rPr>
-        <w:t>从恩宁路进入街区，连续骑楼、窄长街道、灰白立面和成排门窗构成鲜明的岭南城市风貌。道路仍承担通行功能，建筑首层则容纳展览、餐饮、零售与公共服务。由此可见，永庆坊在保留街巷格局的基础上重新组织使用</w:t>
-      </w:r>
-      <w:r>
-        <w:rPr>
-          <w:rFonts w:hint="eastAsia"/>
+        <w:t>从恩宁路进入街区，连续骑楼、窄长街道、灰白立面和成排门窗构成鲜明的岭南城市风貌。道路仍承担通行功能，建筑首层则容纳展览、餐饮、零售与公共服务。由此可见，永庆坊在保留街巷格局的基础上</w:t>
+      </w:r>
+      <w:r>
+        <w:rPr>
+          <w:b/>
+          <w:bCs/>
+          <w:lang w:eastAsia="zh-CN"/>
+        </w:rPr>
+        <w:t>重新组织使用</w:t>
+      </w:r>
+      <w:r>
+        <w:rPr>
+          <w:rFonts w:hint="eastAsia"/>
+          <w:b/>
+          <w:bCs/>
           <w:lang w:eastAsia="zh-CN"/>
         </w:rPr>
         <w:t>原本的骑楼设计和实用</w:t>
       </w:r>
       <w:r>
         <w:rPr>
-          <w:lang w:eastAsia="zh-CN"/>
-        </w:rPr>
-        <w:t>功能。</w:t>
+          <w:b/>
+          <w:bCs/>
+          <w:lang w:eastAsia="zh-CN"/>
+        </w:rPr>
+        <w:t>功能</w:t>
+      </w:r>
+      <w:r>
+        <w:rPr>
+          <w:lang w:eastAsia="zh-CN"/>
+        </w:rPr>
+        <w:t>。</w:t>
       </w:r>
     </w:p>
     <w:p>
@@ -1117,8 +1203,61 @@
           <w:noProof/>
         </w:rPr>
         <w:drawing>
-          <wp:inline distT="0" distB="0" distL="0" distR="0" wp14:anchorId="2558F4A6" wp14:editId="60AE5AD8">
-            <wp:extent cx="5806440" cy="4060517"/>
+          <wp:inline distT="0" distB="0" distL="0" distR="0" wp14:anchorId="33B5F733" wp14:editId="134A3895">
+            <wp:extent cx="1589645" cy="2119746"/>
+            <wp:effectExtent l="0" t="0" r="0" b="0"/>
+            <wp:docPr id="505028244" name="图片 1"/>
+            <wp:cNvGraphicFramePr>
+              <a:graphicFrameLocks xmlns:a="http://schemas.openxmlformats.org/drawingml/2006/main" noChangeAspect="1"/>
+            </wp:cNvGraphicFramePr>
+            <a:graphic xmlns:a="http://schemas.openxmlformats.org/drawingml/2006/main">
+              <a:graphicData uri="http://schemas.openxmlformats.org/drawingml/2006/picture">
+                <pic:pic xmlns:pic="http://schemas.openxmlformats.org/drawingml/2006/picture">
+                  <pic:nvPicPr>
+                    <pic:cNvPr id="0" name="Picture 1"/>
+                    <pic:cNvPicPr>
+                      <a:picLocks noChangeAspect="1" noChangeArrowheads="1"/>
+                    </pic:cNvPicPr>
+                  </pic:nvPicPr>
+                  <pic:blipFill>
+                    <a:blip r:embed="rId9" cstate="print">
+                      <a:extLst>
+                        <a:ext uri="{28A0092B-C50C-407E-A947-70E740481C1C}">
+                          <a14:useLocalDpi xmlns:a14="http://schemas.microsoft.com/office/drawing/2010/main" val="0"/>
+                        </a:ext>
+                      </a:extLst>
+                    </a:blip>
+                    <a:srcRect/>
+                    <a:stretch>
+                      <a:fillRect/>
+                    </a:stretch>
+                  </pic:blipFill>
+                  <pic:spPr bwMode="auto">
+                    <a:xfrm>
+                      <a:off x="0" y="0"/>
+                      <a:ext cx="1612584" cy="2150335"/>
+                    </a:xfrm>
+                    <a:prstGeom prst="rect">
+                      <a:avLst/>
+                    </a:prstGeom>
+                    <a:noFill/>
+                    <a:ln>
+                      <a:noFill/>
+                    </a:ln>
+                  </pic:spPr>
+                </pic:pic>
+              </a:graphicData>
+            </a:graphic>
+          </wp:inline>
+        </w:drawing>
+      </w:r>
+      <w:r>
+        <w:rPr>
+          <w:noProof/>
+        </w:rPr>
+        <w:drawing>
+          <wp:inline distT="0" distB="0" distL="0" distR="0" wp14:anchorId="2558F4A6" wp14:editId="03EFCAC3">
+            <wp:extent cx="1582481" cy="2114938"/>
             <wp:effectExtent l="0" t="0" r="0" b="0"/>
             <wp:docPr id="3" name="Picture 3"/>
             <wp:cNvGraphicFramePr>
@@ -1131,20 +1270,29 @@
                     <pic:cNvPr id="0" name="street.jpg"/>
                     <pic:cNvPicPr/>
                   </pic:nvPicPr>
-                  <pic:blipFill>
-                    <a:blip r:embed="rId9"/>
+                  <pic:blipFill rotWithShape="1">
+                    <a:blip r:embed="rId10"/>
+                    <a:srcRect r="51172" b="6685"/>
                     <a:stretch>
                       <a:fillRect/>
                     </a:stretch>
                   </pic:blipFill>
-                  <pic:spPr>
+                  <pic:spPr bwMode="auto">
                     <a:xfrm>
                       <a:off x="0" y="0"/>
-                      <a:ext cx="5806440" cy="4060517"/>
+                      <a:ext cx="1592190" cy="2127913"/>
                     </a:xfrm>
                     <a:prstGeom prst="rect">
                       <a:avLst/>
                     </a:prstGeom>
+                    <a:ln>
+                      <a:noFill/>
+                    </a:ln>
+                    <a:extLst>
+                      <a:ext uri="{53640926-AAD7-44D8-BBD7-CCE9431645EC}">
+                        <a14:shadowObscured xmlns:a14="http://schemas.microsoft.com/office/drawing/2010/main"/>
+                      </a:ext>
+                    </a:extLst>
                   </pic:spPr>
                 </pic:pic>
               </a:graphicData>
@@ -1195,11 +1343,52 @@
         <w:rPr>
           <w:lang w:eastAsia="zh-CN"/>
         </w:rPr>
-        <w:t>街区建筑保留骑楼柱廊、山花、木窗和传统立面比例，内部则根据现实需要转换用途。这种“外部风貌保护加内部功能更新”的方式延长了老建筑的使用寿命，也使修缮成本能够通过持续运营得到支持。与整体拆除重建相比，</w:t>
+        <w:t>街区建筑保留骑楼柱廊、山花、木窗和传统立面比例，内部则根据现实需要转换用途</w:t>
+      </w:r>
+      <w:r>
+        <w:rPr>
+          <w:rFonts w:hint="eastAsia"/>
+          <w:lang w:eastAsia="zh-CN"/>
+        </w:rPr>
+        <w:t>，即</w:t>
+      </w:r>
+      <w:r>
+        <w:rPr>
+          <w:lang w:eastAsia="zh-CN"/>
+        </w:rPr>
+        <w:t>“外部风貌保护</w:t>
+      </w:r>
+      <w:r>
+        <w:rPr>
+          <w:rFonts w:hint="eastAsia"/>
+          <w:lang w:eastAsia="zh-CN"/>
+        </w:rPr>
+        <w:t>+</w:t>
+      </w:r>
+      <w:r>
+        <w:rPr>
+          <w:lang w:eastAsia="zh-CN"/>
+        </w:rPr>
+        <w:t>内部功能更新”</w:t>
+      </w:r>
+      <w:r>
+        <w:rPr>
+          <w:rFonts w:hint="eastAsia"/>
+          <w:lang w:eastAsia="zh-CN"/>
+        </w:rPr>
+        <w:t>。</w:t>
+      </w:r>
+      <w:r>
+        <w:rPr>
+          <w:lang w:eastAsia="zh-CN"/>
+        </w:rPr>
+        <w:t>与整体拆除重建相比，</w:t>
       </w:r>
       <w:proofErr w:type="gramStart"/>
       <w:r>
         <w:rPr>
+          <w:b/>
+          <w:bCs/>
           <w:lang w:eastAsia="zh-CN"/>
         </w:rPr>
         <w:t>微改造</w:t>
@@ -1209,24 +1398,59 @@
         <w:rPr>
           <w:lang w:eastAsia="zh-CN"/>
         </w:rPr>
-        <w:t>更有利于维持原有空间尺度和地方辨识度。不过，历史建筑若只成为现代消费的外壳，仍可能出现形式保存而文化内涵被削弱的问题，因此建筑活化需要与历史说明、社区记忆和公共文化功能同步推进。</w:t>
-      </w:r>
-    </w:p>
-    <w:p>
-      <w:pPr>
-        <w:keepNext/>
+        <w:t>更有利于维持原有空间尺度和地方辨识度</w:t>
+      </w:r>
+      <w:r>
+        <w:rPr>
+          <w:rFonts w:hint="eastAsia"/>
+          <w:lang w:eastAsia="zh-CN"/>
+        </w:rPr>
+        <w:t>，同时也极大控制成本</w:t>
+      </w:r>
+      <w:r>
+        <w:rPr>
+          <w:lang w:eastAsia="zh-CN"/>
+        </w:rPr>
+        <w:t>。不过，历史建筑若只成为现代消费的外壳，仍可能出现形式保存而文化内涵被削弱的问题，因此</w:t>
+      </w:r>
+      <w:r>
+        <w:rPr>
+          <w:rFonts w:hint="eastAsia"/>
+          <w:lang w:eastAsia="zh-CN"/>
+        </w:rPr>
+        <w:t>，</w:t>
+      </w:r>
+      <w:r>
+        <w:rPr>
+          <w:lang w:eastAsia="zh-CN"/>
+        </w:rPr>
+        <w:t>建筑活化需要与历史记忆和公共文化功能同步推进</w:t>
+      </w:r>
+      <w:r>
+        <w:rPr>
+          <w:rFonts w:hint="eastAsia"/>
+          <w:lang w:eastAsia="zh-CN"/>
+        </w:rPr>
+        <w:t>。</w:t>
+      </w:r>
+    </w:p>
+    <w:p>
+      <w:pPr>
+        <w:ind w:firstLine="480"/>
         <w:jc w:val="center"/>
+        <w:rPr>
+          <w:lang w:eastAsia="zh-CN"/>
+        </w:rPr>
       </w:pPr>
       <w:r>
         <w:rPr>
           <w:noProof/>
         </w:rPr>
-        <w:lastRenderedPageBreak/>
         <w:drawing>
-          <wp:inline distT="0" distB="0" distL="0" distR="0" wp14:anchorId="1BE008CE" wp14:editId="7CBE95BB">
-            <wp:extent cx="5806440" cy="2790108"/>
-            <wp:effectExtent l="0" t="0" r="0" b="0"/>
-            <wp:docPr id="4" name="Picture 4"/>
+          <wp:inline distT="0" distB="0" distL="0" distR="0" wp14:anchorId="5215362C" wp14:editId="75B1A68A">
+            <wp:extent cx="1371128" cy="1828358"/>
+            <wp:effectExtent l="0" t="0" r="635" b="635"/>
+            <wp:docPr id="321751835" name="图片 2"/>
             <wp:cNvGraphicFramePr>
               <a:graphicFrameLocks xmlns:a="http://schemas.openxmlformats.org/drawingml/2006/main" noChangeAspect="1"/>
             </wp:cNvGraphicFramePr>
@@ -1234,23 +1458,36 @@
               <a:graphicData uri="http://schemas.openxmlformats.org/drawingml/2006/picture">
                 <pic:pic xmlns:pic="http://schemas.openxmlformats.org/drawingml/2006/picture">
                   <pic:nvPicPr>
-                    <pic:cNvPr id="0" name="architecture.jpg"/>
-                    <pic:cNvPicPr/>
+                    <pic:cNvPr id="0" name="Picture 2"/>
+                    <pic:cNvPicPr>
+                      <a:picLocks noChangeAspect="1" noChangeArrowheads="1"/>
+                    </pic:cNvPicPr>
                   </pic:nvPicPr>
                   <pic:blipFill>
-                    <a:blip r:embed="rId10"/>
+                    <a:blip r:embed="rId11" cstate="print">
+                      <a:extLst>
+                        <a:ext uri="{28A0092B-C50C-407E-A947-70E740481C1C}">
+                          <a14:useLocalDpi xmlns:a14="http://schemas.microsoft.com/office/drawing/2010/main" val="0"/>
+                        </a:ext>
+                      </a:extLst>
+                    </a:blip>
+                    <a:srcRect/>
                     <a:stretch>
                       <a:fillRect/>
                     </a:stretch>
                   </pic:blipFill>
-                  <pic:spPr>
+                  <pic:spPr bwMode="auto">
                     <a:xfrm>
                       <a:off x="0" y="0"/>
-                      <a:ext cx="5806440" cy="2790108"/>
+                      <a:ext cx="1383284" cy="1844568"/>
                     </a:xfrm>
                     <a:prstGeom prst="rect">
                       <a:avLst/>
                     </a:prstGeom>
+                    <a:noFill/>
+                    <a:ln>
+                      <a:noFill/>
+                    </a:ln>
                   </pic:spPr>
                 </pic:pic>
               </a:graphicData>
@@ -1258,94 +1495,15 @@
           </wp:inline>
         </w:drawing>
       </w:r>
-    </w:p>
-    <w:p>
-      <w:pPr>
-        <w:pStyle w:val="10"/>
-        <w:keepLines/>
-        <w:jc w:val="center"/>
-        <w:rPr>
-          <w:lang w:eastAsia="zh-CN"/>
-        </w:rPr>
-      </w:pPr>
-      <w:r>
-        <w:rPr>
-          <w:lang w:eastAsia="zh-CN"/>
-        </w:rPr>
-        <w:t>图3 传统建筑立面及文化空间的活化利用（来源：用户提供的图片汇编PDF，第25、28页）</w:t>
-      </w:r>
-    </w:p>
-    <w:p>
-      <w:pPr>
-        <w:pStyle w:val="2"/>
-        <w:rPr>
-          <w:lang w:eastAsia="zh-CN"/>
-        </w:rPr>
-      </w:pPr>
-      <w:r>
-        <w:rPr>
-          <w:lang w:eastAsia="zh-CN"/>
-        </w:rPr>
-        <w:t>（三）考察岭南文化和非</w:t>
-      </w:r>
-      <w:proofErr w:type="gramStart"/>
-      <w:r>
-        <w:rPr>
-          <w:lang w:eastAsia="zh-CN"/>
-        </w:rPr>
-        <w:t>遗项目</w:t>
-      </w:r>
-      <w:proofErr w:type="gramEnd"/>
-      <w:r>
-        <w:rPr>
-          <w:lang w:eastAsia="zh-CN"/>
-        </w:rPr>
-        <w:t>的展示</w:t>
-      </w:r>
-    </w:p>
-    <w:p>
-      <w:pPr>
-        <w:ind w:firstLine="480"/>
-        <w:rPr>
-          <w:lang w:eastAsia="zh-CN"/>
-        </w:rPr>
-      </w:pPr>
-      <w:r>
-        <w:rPr>
-          <w:lang w:eastAsia="zh-CN"/>
-        </w:rPr>
-        <w:t>粤剧艺术博物馆及相关戏台、服饰与装饰元素，为街区建立了清晰的文化主题。传统工艺不再只以文字说明出现，而是通过实物陈列、舞台空间、视觉设计和</w:t>
-      </w:r>
-      <w:proofErr w:type="gramStart"/>
-      <w:r>
-        <w:rPr>
-          <w:lang w:eastAsia="zh-CN"/>
-        </w:rPr>
-        <w:t>文创</w:t>
-      </w:r>
-      <w:proofErr w:type="gramEnd"/>
-      <w:r>
-        <w:rPr>
-          <w:lang w:eastAsia="zh-CN"/>
-        </w:rPr>
-        <w:t>产品进入游客的观看与消费过程。此类表达降低了青年接触传统文化的门槛，也适合通过照片和短视频继续传播。但部分展示若缺少技艺流程、传承人故事和历史语境，容易停留在“好看、好拍”的符号层面。真正的非遗活化应让观众理解材料、工序、使用场景及其背后的社会关系。</w:t>
-      </w:r>
-    </w:p>
-    <w:p>
-      <w:pPr>
-        <w:keepNext/>
-        <w:jc w:val="center"/>
-      </w:pPr>
       <w:r>
         <w:rPr>
           <w:noProof/>
         </w:rPr>
-        <w:lastRenderedPageBreak/>
         <w:drawing>
-          <wp:inline distT="0" distB="0" distL="0" distR="0" wp14:anchorId="36833167" wp14:editId="620B09AB">
-            <wp:extent cx="5806440" cy="4060517"/>
-            <wp:effectExtent l="0" t="0" r="0" b="0"/>
-            <wp:docPr id="5" name="Picture 5"/>
+          <wp:inline distT="0" distB="0" distL="0" distR="0" wp14:anchorId="27E6EE42" wp14:editId="044F6A67">
+            <wp:extent cx="1356551" cy="1808922"/>
+            <wp:effectExtent l="0" t="0" r="0" b="1270"/>
+            <wp:docPr id="707522934" name="图片 3"/>
             <wp:cNvGraphicFramePr>
               <a:graphicFrameLocks xmlns:a="http://schemas.openxmlformats.org/drawingml/2006/main" noChangeAspect="1"/>
             </wp:cNvGraphicFramePr>
@@ -1353,23 +1511,36 @@
               <a:graphicData uri="http://schemas.openxmlformats.org/drawingml/2006/picture">
                 <pic:pic xmlns:pic="http://schemas.openxmlformats.org/drawingml/2006/picture">
                   <pic:nvPicPr>
-                    <pic:cNvPr id="0" name="opera.jpg"/>
-                    <pic:cNvPicPr/>
+                    <pic:cNvPr id="0" name="Picture 3"/>
+                    <pic:cNvPicPr>
+                      <a:picLocks noChangeAspect="1" noChangeArrowheads="1"/>
+                    </pic:cNvPicPr>
                   </pic:nvPicPr>
                   <pic:blipFill>
-                    <a:blip r:embed="rId11"/>
+                    <a:blip r:embed="rId12" cstate="print">
+                      <a:extLst>
+                        <a:ext uri="{28A0092B-C50C-407E-A947-70E740481C1C}">
+                          <a14:useLocalDpi xmlns:a14="http://schemas.microsoft.com/office/drawing/2010/main" val="0"/>
+                        </a:ext>
+                      </a:extLst>
+                    </a:blip>
+                    <a:srcRect/>
                     <a:stretch>
                       <a:fillRect/>
                     </a:stretch>
                   </pic:blipFill>
-                  <pic:spPr>
+                  <pic:spPr bwMode="auto">
                     <a:xfrm>
                       <a:off x="0" y="0"/>
-                      <a:ext cx="5806440" cy="4060517"/>
+                      <a:ext cx="1365735" cy="1821169"/>
                     </a:xfrm>
                     <a:prstGeom prst="rect">
                       <a:avLst/>
                     </a:prstGeom>
+                    <a:noFill/>
+                    <a:ln>
+                      <a:noFill/>
+                    </a:ln>
                   </pic:spPr>
                 </pic:pic>
               </a:graphicData>
@@ -1391,7 +1562,185 @@
         <w:rPr>
           <w:lang w:eastAsia="zh-CN"/>
         </w:rPr>
-        <w:t>图4 粤剧艺术博物馆及戏台展示（来源：用户提供的图片汇编PDF，第11、12页）</w:t>
+        <w:t>图3 传统建筑立面及文化空间的活化利用</w:t>
+      </w:r>
+    </w:p>
+    <w:p>
+      <w:pPr>
+        <w:pStyle w:val="2"/>
+        <w:spacing w:line="240" w:lineRule="auto"/>
+        <w:rPr>
+          <w:lang w:eastAsia="zh-CN"/>
+        </w:rPr>
+      </w:pPr>
+      <w:r>
+        <w:rPr>
+          <w:lang w:eastAsia="zh-CN"/>
+        </w:rPr>
+        <w:lastRenderedPageBreak/>
+        <w:t>（三）考察岭南文化和非</w:t>
+      </w:r>
+      <w:proofErr w:type="gramStart"/>
+      <w:r>
+        <w:rPr>
+          <w:lang w:eastAsia="zh-CN"/>
+        </w:rPr>
+        <w:t>遗项目</w:t>
+      </w:r>
+      <w:proofErr w:type="gramEnd"/>
+      <w:r>
+        <w:rPr>
+          <w:lang w:eastAsia="zh-CN"/>
+        </w:rPr>
+        <w:t>的展示</w:t>
+      </w:r>
+    </w:p>
+    <w:p>
+      <w:pPr>
+        <w:ind w:firstLine="480"/>
+        <w:rPr>
+          <w:lang w:eastAsia="zh-CN"/>
+        </w:rPr>
+      </w:pPr>
+      <w:r>
+        <w:rPr>
+          <w:lang w:eastAsia="zh-CN"/>
+        </w:rPr>
+        <w:t>粤剧艺术博物馆</w:t>
+      </w:r>
+      <w:r>
+        <w:rPr>
+          <w:rFonts w:hint="eastAsia"/>
+          <w:lang w:eastAsia="zh-CN"/>
+        </w:rPr>
+        <w:t>的</w:t>
+      </w:r>
+      <w:r>
+        <w:rPr>
+          <w:lang w:eastAsia="zh-CN"/>
+        </w:rPr>
+        <w:t>戏台、服饰与装饰元素，</w:t>
+      </w:r>
+      <w:r>
+        <w:rPr>
+          <w:rFonts w:hint="eastAsia"/>
+          <w:lang w:eastAsia="zh-CN"/>
+        </w:rPr>
+        <w:t>体现了</w:t>
+      </w:r>
+      <w:r>
+        <w:rPr>
+          <w:lang w:eastAsia="zh-CN"/>
+        </w:rPr>
+        <w:t>清晰的文化主题。传统工艺通过实物陈列、舞台空间、视觉设计和</w:t>
+      </w:r>
+      <w:proofErr w:type="gramStart"/>
+      <w:r>
+        <w:rPr>
+          <w:lang w:eastAsia="zh-CN"/>
+        </w:rPr>
+        <w:t>文创</w:t>
+      </w:r>
+      <w:proofErr w:type="gramEnd"/>
+      <w:r>
+        <w:rPr>
+          <w:lang w:eastAsia="zh-CN"/>
+        </w:rPr>
+        <w:t>产品进入游客的观看与消费过程</w:t>
+      </w:r>
+      <w:r>
+        <w:rPr>
+          <w:rFonts w:hint="eastAsia"/>
+          <w:lang w:eastAsia="zh-CN"/>
+        </w:rPr>
+        <w:t>，</w:t>
+      </w:r>
+      <w:r>
+        <w:rPr>
+          <w:lang w:eastAsia="zh-CN"/>
+        </w:rPr>
+        <w:t>降低了青年接触传统文化的门槛，也适合通过照片和短视频继续</w:t>
+      </w:r>
+      <w:r>
+        <w:rPr>
+          <w:rFonts w:hint="eastAsia"/>
+          <w:lang w:eastAsia="zh-CN"/>
+        </w:rPr>
+        <w:t>网络</w:t>
+      </w:r>
+      <w:r>
+        <w:rPr>
+          <w:lang w:eastAsia="zh-CN"/>
+        </w:rPr>
+        <w:t>传播。但部分展示缺少技艺流程和历史语境，</w:t>
+      </w:r>
+      <w:r>
+        <w:rPr>
+          <w:rFonts w:hint="eastAsia"/>
+          <w:lang w:eastAsia="zh-CN"/>
+        </w:rPr>
+        <w:t>有</w:t>
+      </w:r>
+      <w:r>
+        <w:rPr>
+          <w:rFonts w:hint="eastAsia"/>
+          <w:lang w:eastAsia="zh-CN"/>
+        </w:rPr>
+        <w:t>落入</w:t>
+      </w:r>
+      <w:r>
+        <w:rPr>
+          <w:lang w:eastAsia="zh-CN"/>
+        </w:rPr>
+        <w:t>“好看、好拍</w:t>
+      </w:r>
+      <w:r>
+        <w:rPr>
+          <w:rFonts w:hint="eastAsia"/>
+          <w:lang w:eastAsia="zh-CN"/>
+        </w:rPr>
+        <w:t>、好忘</w:t>
+      </w:r>
+      <w:r>
+        <w:rPr>
+          <w:lang w:eastAsia="zh-CN"/>
+        </w:rPr>
+        <w:t>”</w:t>
+      </w:r>
+      <w:proofErr w:type="gramStart"/>
+      <w:r>
+        <w:rPr>
+          <w:lang w:eastAsia="zh-CN"/>
+        </w:rPr>
+        <w:t>的</w:t>
+      </w:r>
+      <w:r>
+        <w:rPr>
+          <w:rFonts w:hint="eastAsia"/>
+          <w:lang w:eastAsia="zh-CN"/>
+        </w:rPr>
+        <w:t>网红循环</w:t>
+      </w:r>
+      <w:proofErr w:type="gramEnd"/>
+      <w:r>
+        <w:rPr>
+          <w:rFonts w:hint="eastAsia"/>
+          <w:lang w:eastAsia="zh-CN"/>
+        </w:rPr>
+        <w:t>的风险</w:t>
+      </w:r>
+      <w:r>
+        <w:rPr>
+          <w:lang w:eastAsia="zh-CN"/>
+        </w:rPr>
+        <w:t>。真正的非遗活化应让观众</w:t>
+      </w:r>
+      <w:r>
+        <w:rPr>
+          <w:rFonts w:hint="eastAsia"/>
+          <w:lang w:eastAsia="zh-CN"/>
+        </w:rPr>
+        <w:t>切身实际地感受背后的历史，</w:t>
       </w:r>
     </w:p>
     <w:p>
@@ -1403,11 +1752,86 @@
         <w:rPr>
           <w:noProof/>
         </w:rPr>
+        <w:drawing>
+          <wp:inline distT="0" distB="0" distL="0" distR="0" wp14:anchorId="0EE09C99" wp14:editId="460F6E79">
+            <wp:extent cx="4406419" cy="5872348"/>
+            <wp:effectExtent l="0" t="0" r="0" b="0"/>
+            <wp:docPr id="1141303178" name="图片 8"/>
+            <wp:cNvGraphicFramePr>
+              <a:graphicFrameLocks xmlns:a="http://schemas.openxmlformats.org/drawingml/2006/main" noChangeAspect="1"/>
+            </wp:cNvGraphicFramePr>
+            <a:graphic xmlns:a="http://schemas.openxmlformats.org/drawingml/2006/main">
+              <a:graphicData uri="http://schemas.openxmlformats.org/drawingml/2006/picture">
+                <pic:pic xmlns:pic="http://schemas.openxmlformats.org/drawingml/2006/picture">
+                  <pic:nvPicPr>
+                    <pic:cNvPr id="0" name="Picture 8"/>
+                    <pic:cNvPicPr>
+                      <a:picLocks noChangeAspect="1" noChangeArrowheads="1"/>
+                    </pic:cNvPicPr>
+                  </pic:nvPicPr>
+                  <pic:blipFill>
+                    <a:blip r:embed="rId13" cstate="print">
+                      <a:extLst>
+                        <a:ext uri="{28A0092B-C50C-407E-A947-70E740481C1C}">
+                          <a14:useLocalDpi xmlns:a14="http://schemas.microsoft.com/office/drawing/2010/main" val="0"/>
+                        </a:ext>
+                      </a:extLst>
+                    </a:blip>
+                    <a:srcRect/>
+                    <a:stretch>
+                      <a:fillRect/>
+                    </a:stretch>
+                  </pic:blipFill>
+                  <pic:spPr bwMode="auto">
+                    <a:xfrm>
+                      <a:off x="0" y="0"/>
+                      <a:ext cx="4417724" cy="5887414"/>
+                    </a:xfrm>
+                    <a:prstGeom prst="rect">
+                      <a:avLst/>
+                    </a:prstGeom>
+                    <a:noFill/>
+                    <a:ln>
+                      <a:noFill/>
+                    </a:ln>
+                  </pic:spPr>
+                </pic:pic>
+              </a:graphicData>
+            </a:graphic>
+          </wp:inline>
+        </w:drawing>
+      </w:r>
+    </w:p>
+    <w:p>
+      <w:pPr>
+        <w:pStyle w:val="10"/>
+        <w:keepLines/>
+        <w:jc w:val="center"/>
+        <w:rPr>
+          <w:lang w:eastAsia="zh-CN"/>
+        </w:rPr>
+      </w:pPr>
+      <w:r>
+        <w:rPr>
+          <w:lang w:eastAsia="zh-CN"/>
+        </w:rPr>
+        <w:t>图4 粤剧艺术博物馆及戏台展示（来源：用户提供的图片汇编PDF，第11、12页）</w:t>
+      </w:r>
+    </w:p>
+    <w:p>
+      <w:pPr>
+        <w:keepNext/>
+        <w:jc w:val="center"/>
+      </w:pPr>
+      <w:r>
+        <w:rPr>
+          <w:noProof/>
+        </w:rPr>
         <w:lastRenderedPageBreak/>
         <w:drawing>
-          <wp:inline distT="0" distB="0" distL="0" distR="0" wp14:anchorId="5C7EC960" wp14:editId="07004311">
-            <wp:extent cx="5806440" cy="4292863"/>
-            <wp:effectExtent l="0" t="0" r="0" b="0"/>
+          <wp:inline distT="0" distB="0" distL="0" distR="0" wp14:anchorId="5C7EC960" wp14:editId="520A12C5">
+            <wp:extent cx="4180115" cy="2889796"/>
+            <wp:effectExtent l="0" t="0" r="0" b="6350"/>
             <wp:docPr id="6" name="Picture 6"/>
             <wp:cNvGraphicFramePr>
               <a:graphicFrameLocks xmlns:a="http://schemas.openxmlformats.org/drawingml/2006/main" noChangeAspect="1"/>
@@ -1419,20 +1843,29 @@
                     <pic:cNvPr id="0" name="heritage.jpg"/>
                     <pic:cNvPicPr/>
                   </pic:nvPicPr>
-                  <pic:blipFill>
-                    <a:blip r:embed="rId12"/>
+                  <pic:blipFill rotWithShape="1">
+                    <a:blip r:embed="rId14"/>
+                    <a:srcRect b="6493"/>
                     <a:stretch>
                       <a:fillRect/>
                     </a:stretch>
                   </pic:blipFill>
-                  <pic:spPr>
+                  <pic:spPr bwMode="auto">
                     <a:xfrm>
                       <a:off x="0" y="0"/>
-                      <a:ext cx="5806440" cy="4292863"/>
+                      <a:ext cx="4187316" cy="2894774"/>
                     </a:xfrm>
                     <a:prstGeom prst="rect">
                       <a:avLst/>
                     </a:prstGeom>
+                    <a:ln>
+                      <a:noFill/>
+                    </a:ln>
+                    <a:extLst>
+                      <a:ext uri="{53640926-AAD7-44D8-BBD7-CCE9431645EC}">
+                        <a14:shadowObscured xmlns:a14="http://schemas.microsoft.com/office/drawing/2010/main"/>
+                      </a:ext>
+                    </a:extLst>
                   </pic:spPr>
                 </pic:pic>
               </a:graphicData>
@@ -1454,12 +1887,13 @@
         <w:rPr>
           <w:lang w:eastAsia="zh-CN"/>
         </w:rPr>
-        <w:t>图5 传统工艺展示与粤剧头饰细节（来源：用户提供的图片汇编PDF，第22、26页）</w:t>
+        <w:t>图5 传统工艺展示</w:t>
       </w:r>
     </w:p>
     <w:p>
       <w:pPr>
         <w:pStyle w:val="2"/>
+        <w:spacing w:line="240" w:lineRule="auto"/>
         <w:rPr>
           <w:lang w:eastAsia="zh-CN"/>
         </w:rPr>
@@ -1489,14 +1923,40 @@
       <w:pPr>
         <w:ind w:firstLine="480"/>
         <w:rPr>
-          <w:lang w:eastAsia="zh-CN"/>
-        </w:rPr>
-      </w:pPr>
-      <w:r>
-        <w:rPr>
-          <w:lang w:eastAsia="zh-CN"/>
-        </w:rPr>
-        <w:t>餐饮、文创、休闲和特色零售增强了街区人气，一些店铺主动使用粤语文字、醒狮或粤剧图案，形成地方识别。商业进入能够创造就业、延长游客停留时间，并为建筑维护和文化活动提供运营基础。然而，热门历史街区普遍容易出现咖啡、奶茶、</w:t>
+          <w:noProof/>
+        </w:rPr>
+      </w:pPr>
+      <w:r>
+        <w:rPr>
+          <w:lang w:eastAsia="zh-CN"/>
+        </w:rPr>
+        <w:t>餐饮、文创、休闲和特色零售增强了街区人气，一些店铺主动使用粤语文字、醒狮或粤剧图案，形成地方</w:t>
+      </w:r>
+      <w:r>
+        <w:rPr>
+          <w:rFonts w:hint="eastAsia"/>
+          <w:lang w:eastAsia="zh-CN"/>
+        </w:rPr>
+        <w:t>文化特色</w:t>
+      </w:r>
+      <w:r>
+        <w:rPr>
+          <w:lang w:eastAsia="zh-CN"/>
+        </w:rPr>
+        <w:t>。商业</w:t>
+      </w:r>
+      <w:r>
+        <w:rPr>
+          <w:rFonts w:hint="eastAsia"/>
+          <w:lang w:eastAsia="zh-CN"/>
+        </w:rPr>
+        <w:t>导入</w:t>
+      </w:r>
+      <w:r>
+        <w:rPr>
+          <w:lang w:eastAsia="zh-CN"/>
+        </w:rPr>
+        <w:t>能够创造就业、延长游客停留时间，并为建筑维护和文化活动提供运营基础。然而，热门历史街区普遍容易出现咖啡、奶茶、</w:t>
       </w:r>
       <w:proofErr w:type="gramStart"/>
       <w:r>
@@ -1524,21 +1984,7 @@
         <w:rPr>
           <w:lang w:eastAsia="zh-CN"/>
         </w:rPr>
-        <w:t>重复的现象。</w:t>
-      </w:r>
-      <w:proofErr w:type="gramStart"/>
-      <w:r>
-        <w:rPr>
-          <w:lang w:eastAsia="zh-CN"/>
-        </w:rPr>
-        <w:t>永庆坊若要</w:t>
-      </w:r>
-      <w:proofErr w:type="gramEnd"/>
-      <w:r>
-        <w:rPr>
-          <w:lang w:eastAsia="zh-CN"/>
-        </w:rPr>
-        <w:t>保持独特性，应提高本地原创产品、非遗生产性展示和老字号业态的比例，使商业真正服务于文化内容。</w:t>
+        <w:t>重复的现象。永庆坊若要保持独特性，应提高本地原创产品、非遗生产性展示和老字号业态的比例，使商业真正服务于文化内容。</w:t>
       </w:r>
     </w:p>
     <w:p>
@@ -1550,11 +1996,10 @@
         <w:rPr>
           <w:noProof/>
         </w:rPr>
-        <w:lastRenderedPageBreak/>
         <w:drawing>
-          <wp:inline distT="0" distB="0" distL="0" distR="0" wp14:anchorId="301998D3" wp14:editId="6108B296">
-            <wp:extent cx="5806440" cy="4060517"/>
-            <wp:effectExtent l="0" t="0" r="0" b="0"/>
+          <wp:inline distT="0" distB="0" distL="0" distR="0" wp14:anchorId="301998D3" wp14:editId="3608A7B5">
+            <wp:extent cx="4105326" cy="2666011"/>
+            <wp:effectExtent l="0" t="0" r="0" b="1270"/>
             <wp:docPr id="7" name="Picture 7"/>
             <wp:cNvGraphicFramePr>
               <a:graphicFrameLocks xmlns:a="http://schemas.openxmlformats.org/drawingml/2006/main" noChangeAspect="1"/>
@@ -1566,20 +2011,29 @@
                     <pic:cNvPr id="0" name="commerce.jpg"/>
                     <pic:cNvPicPr/>
                   </pic:nvPicPr>
-                  <pic:blipFill>
-                    <a:blip r:embed="rId13"/>
+                  <pic:blipFill rotWithShape="1">
+                    <a:blip r:embed="rId15"/>
+                    <a:srcRect b="7137"/>
                     <a:stretch>
                       <a:fillRect/>
                     </a:stretch>
                   </pic:blipFill>
-                  <pic:spPr>
+                  <pic:spPr bwMode="auto">
                     <a:xfrm>
                       <a:off x="0" y="0"/>
-                      <a:ext cx="5806440" cy="4060517"/>
+                      <a:ext cx="4129854" cy="2681940"/>
                     </a:xfrm>
                     <a:prstGeom prst="rect">
                       <a:avLst/>
                     </a:prstGeom>
+                    <a:ln>
+                      <a:noFill/>
+                    </a:ln>
+                    <a:extLst>
+                      <a:ext uri="{53640926-AAD7-44D8-BBD7-CCE9431645EC}">
+                        <a14:shadowObscured xmlns:a14="http://schemas.microsoft.com/office/drawing/2010/main"/>
+                      </a:ext>
+                    </a:extLst>
                   </pic:spPr>
                 </pic:pic>
               </a:graphicData>
@@ -1601,20 +2055,22 @@
         <w:rPr>
           <w:lang w:eastAsia="zh-CN"/>
         </w:rPr>
-        <w:t>图6 游客活动、现代商业与岭南街区符号（来源：用户提供的图片汇编PDF，第20、35页）</w:t>
+        <w:t>图6 游客活动、现代商业与岭南街区符号</w:t>
       </w:r>
     </w:p>
     <w:p>
       <w:pPr>
         <w:pStyle w:val="2"/>
-        <w:rPr>
-          <w:lang w:eastAsia="zh-CN"/>
-        </w:rPr>
-      </w:pPr>
-      <w:r>
-        <w:rPr>
-          <w:lang w:eastAsia="zh-CN"/>
-        </w:rPr>
+        <w:spacing w:line="240" w:lineRule="auto"/>
+        <w:rPr>
+          <w:lang w:eastAsia="zh-CN"/>
+        </w:rPr>
+      </w:pPr>
+      <w:r>
+        <w:rPr>
+          <w:lang w:eastAsia="zh-CN"/>
+        </w:rPr>
+        <w:lastRenderedPageBreak/>
         <w:t>（五）观察公共空间与街区活力</w:t>
       </w:r>
     </w:p>
@@ -1622,14 +2078,61 @@
       <w:pPr>
         <w:ind w:firstLine="480"/>
         <w:rPr>
-          <w:lang w:eastAsia="zh-CN"/>
-        </w:rPr>
-      </w:pPr>
-      <w:r>
-        <w:rPr>
-          <w:lang w:eastAsia="zh-CN"/>
-        </w:rPr>
-        <w:t>滨河桥梁、游船和夜间照明扩展了街区的活动时间，也使传统建筑与水岸景观形成连续的公共空间。夜景提升了城市形象和旅游吸引力，但客流、灯光和活动安排仍应兼顾周边生活环境。历史街区不是只有游客的舞台，其可持续性还取决于日常通行、休憩和社区使用是否便利。</w:t>
+          <w:rFonts w:hint="eastAsia"/>
+          <w:lang w:eastAsia="zh-CN"/>
+        </w:rPr>
+      </w:pPr>
+      <w:r>
+        <w:rPr>
+          <w:rFonts w:hint="eastAsia"/>
+          <w:lang w:eastAsia="zh-CN"/>
+        </w:rPr>
+        <w:t>月亮桥</w:t>
+      </w:r>
+      <w:r>
+        <w:rPr>
+          <w:lang w:eastAsia="zh-CN"/>
+        </w:rPr>
+        <w:t>、游船</w:t>
+      </w:r>
+      <w:r>
+        <w:rPr>
+          <w:rFonts w:hint="eastAsia"/>
+          <w:lang w:eastAsia="zh-CN"/>
+        </w:rPr>
+        <w:t>为代表的夜景扩大</w:t>
+      </w:r>
+      <w:r>
+        <w:rPr>
+          <w:lang w:eastAsia="zh-CN"/>
+        </w:rPr>
+        <w:t>了街区的活动时间</w:t>
+      </w:r>
+      <w:r>
+        <w:rPr>
+          <w:rFonts w:hint="eastAsia"/>
+          <w:lang w:eastAsia="zh-CN"/>
+        </w:rPr>
+        <w:t>范围</w:t>
+      </w:r>
+      <w:r>
+        <w:rPr>
+          <w:lang w:eastAsia="zh-CN"/>
+        </w:rPr>
+        <w:t>，也使传统建筑与水岸景观形成连续的公共空间。</w:t>
+      </w:r>
+      <w:r>
+        <w:rPr>
+          <w:rFonts w:hint="eastAsia"/>
+          <w:lang w:eastAsia="zh-CN"/>
+        </w:rPr>
+        <w:t>美丽的</w:t>
+      </w:r>
+      <w:r>
+        <w:rPr>
+          <w:lang w:eastAsia="zh-CN"/>
+        </w:rPr>
+        <w:t>夜景提升了城市形象，但客流、灯光和活动安排仍应兼顾周边生活环境。历史街区不是只有游客的舞台，其可持续性还取决于日常通行、休憩和社区使用是否便利。</w:t>
       </w:r>
     </w:p>
     <w:p>
@@ -1641,11 +2144,10 @@
         <w:rPr>
           <w:noProof/>
         </w:rPr>
-        <w:lastRenderedPageBreak/>
         <w:drawing>
-          <wp:inline distT="0" distB="0" distL="0" distR="0" wp14:anchorId="25B81FD3" wp14:editId="23A9BABE">
-            <wp:extent cx="5806440" cy="2935678"/>
-            <wp:effectExtent l="0" t="0" r="0" b="0"/>
+          <wp:inline distT="0" distB="0" distL="0" distR="0" wp14:anchorId="25B81FD3" wp14:editId="78F95784">
+            <wp:extent cx="5806296" cy="2730199"/>
+            <wp:effectExtent l="0" t="0" r="4445" b="0"/>
             <wp:docPr id="8" name="Picture 8"/>
             <wp:cNvGraphicFramePr>
               <a:graphicFrameLocks xmlns:a="http://schemas.openxmlformats.org/drawingml/2006/main" noChangeAspect="1"/>
@@ -1657,20 +2159,29 @@
                     <pic:cNvPr id="0" name="water.jpg"/>
                     <pic:cNvPicPr/>
                   </pic:nvPicPr>
-                  <pic:blipFill>
-                    <a:blip r:embed="rId14"/>
+                  <pic:blipFill rotWithShape="1">
+                    <a:blip r:embed="rId16"/>
+                    <a:srcRect b="6997"/>
                     <a:stretch>
                       <a:fillRect/>
                     </a:stretch>
                   </pic:blipFill>
-                  <pic:spPr>
+                  <pic:spPr bwMode="auto">
                     <a:xfrm>
                       <a:off x="0" y="0"/>
-                      <a:ext cx="5806440" cy="2935678"/>
+                      <a:ext cx="5806440" cy="2730267"/>
                     </a:xfrm>
                     <a:prstGeom prst="rect">
                       <a:avLst/>
                     </a:prstGeom>
+                    <a:ln>
+                      <a:noFill/>
+                    </a:ln>
+                    <a:extLst>
+                      <a:ext uri="{53640926-AAD7-44D8-BBD7-CCE9431645EC}">
+                        <a14:shadowObscured xmlns:a14="http://schemas.microsoft.com/office/drawing/2010/main"/>
+                      </a:ext>
+                    </a:extLst>
                   </pic:spPr>
                 </pic:pic>
               </a:graphicData>
@@ -1685,14 +2196,22 @@
         <w:keepLines/>
         <w:jc w:val="center"/>
         <w:rPr>
-          <w:lang w:eastAsia="zh-CN"/>
-        </w:rPr>
-      </w:pPr>
-      <w:r>
-        <w:rPr>
-          <w:lang w:eastAsia="zh-CN"/>
-        </w:rPr>
-        <w:t>图7 滨河桥梁、游船与夜间公共空间（来源：用户提供的图片汇编PDF，第16、36页）</w:t>
+          <w:rFonts w:hint="eastAsia"/>
+          <w:lang w:eastAsia="zh-CN"/>
+        </w:rPr>
+      </w:pPr>
+      <w:r>
+        <w:rPr>
+          <w:lang w:eastAsia="zh-CN"/>
+        </w:rPr>
+        <w:t xml:space="preserve">图7 </w:t>
+      </w:r>
+      <w:r>
+        <w:rPr>
+          <w:rFonts w:hint="eastAsia"/>
+          <w:lang w:eastAsia="zh-CN"/>
+        </w:rPr>
+        <w:t>月亮桥昼夜景观</w:t>
       </w:r>
     </w:p>
     <w:p>
@@ -1701,15 +2220,31 @@
         <w:pBdr>
           <w:bottom w:val="single" w:sz="8" w:space="4" w:color="7086E8"/>
         </w:pBdr>
-        <w:rPr>
-          <w:lang w:eastAsia="zh-CN"/>
-        </w:rPr>
-      </w:pPr>
-      <w:r>
-        <w:rPr>
-          <w:lang w:eastAsia="zh-CN"/>
-        </w:rPr>
-        <w:t>五、访谈记录与材料说明</w:t>
+        <w:spacing w:line="240" w:lineRule="auto"/>
+        <w:rPr>
+          <w:lang w:eastAsia="zh-CN"/>
+        </w:rPr>
+      </w:pPr>
+      <w:r>
+        <w:rPr>
+          <w:lang w:eastAsia="zh-CN"/>
+        </w:rPr>
+        <w:t>六、实践发现与结果分析</w:t>
+      </w:r>
+    </w:p>
+    <w:p>
+      <w:pPr>
+        <w:pStyle w:val="2"/>
+        <w:spacing w:line="240" w:lineRule="auto"/>
+        <w:rPr>
+          <w:lang w:eastAsia="zh-CN"/>
+        </w:rPr>
+      </w:pPr>
+      <w:r>
+        <w:rPr>
+          <w:lang w:eastAsia="zh-CN"/>
+        </w:rPr>
+        <w:t>（一）历史建筑保护与功能更新形成协同</w:t>
       </w:r>
     </w:p>
     <w:p>
@@ -1723,21 +2258,249 @@
         <w:rPr>
           <w:lang w:eastAsia="zh-CN"/>
         </w:rPr>
-        <w:t>课程任务鼓励通过访谈获得第一手资料，但当前文件夹中没有可核验的访谈记录。为保证学术诚信，本报告不代写受访者回答，也不把网络评论包装</w:t>
+        <w:t>骑楼街道和传统立面保存了可辨认的历史空间，新的展览、商业和服务功能则</w:t>
+      </w:r>
+      <w:r>
+        <w:rPr>
+          <w:rFonts w:hint="eastAsia"/>
+          <w:lang w:eastAsia="zh-CN"/>
+        </w:rPr>
+        <w:t>给建筑赋予了新的生命</w:t>
+      </w:r>
+      <w:r>
+        <w:rPr>
+          <w:lang w:eastAsia="zh-CN"/>
+        </w:rPr>
+        <w:t>。</w:t>
+      </w:r>
+      <w:r>
+        <w:rPr>
+          <w:rFonts w:hint="eastAsia"/>
+          <w:lang w:eastAsia="zh-CN"/>
+        </w:rPr>
+        <w:t>永庆坊</w:t>
+      </w:r>
+      <w:r>
+        <w:rPr>
+          <w:rFonts w:hint="eastAsia"/>
+          <w:lang w:eastAsia="zh-CN"/>
+        </w:rPr>
+        <w:t>将旧的建筑改造为新的商业、文化综合体，将传统文化很好融入了现代商业，让文化遗产得以传承、历久弥新。</w:t>
+      </w:r>
+    </w:p>
+    <w:p>
+      <w:pPr>
+        <w:pStyle w:val="2"/>
+        <w:spacing w:line="240" w:lineRule="auto"/>
+        <w:rPr>
+          <w:lang w:eastAsia="zh-CN"/>
+        </w:rPr>
+      </w:pPr>
+      <w:r>
+        <w:rPr>
+          <w:lang w:eastAsia="zh-CN"/>
+        </w:rPr>
+        <w:t>（二）岭南文化传播方式更加年轻化</w:t>
+      </w:r>
+    </w:p>
+    <w:p>
+      <w:pPr>
+        <w:ind w:firstLine="480"/>
+        <w:rPr>
+          <w:lang w:eastAsia="zh-CN"/>
+        </w:rPr>
+      </w:pPr>
+      <w:r>
+        <w:rPr>
+          <w:lang w:eastAsia="zh-CN"/>
+        </w:rPr>
+        <w:t>粤剧舞台、服饰纹样、</w:t>
       </w:r>
       <w:proofErr w:type="gramStart"/>
       <w:r>
         <w:rPr>
           <w:lang w:eastAsia="zh-CN"/>
         </w:rPr>
-        <w:t>成现场</w:t>
+        <w:t>墙绘和文创设计把</w:t>
       </w:r>
       <w:proofErr w:type="gramEnd"/>
       <w:r>
         <w:rPr>
           <w:lang w:eastAsia="zh-CN"/>
         </w:rPr>
-        <w:t>访谈。后续如补充真实访谈，建议分别选择一名游客和一名商户或工作人员，询问到访动机、最具吸引力的文化内容、客流变化以及目前存在的问题，并记录日期、地点、对象类别和授权情况。附件表格可直接用于补录。</w:t>
+        <w:t>抽象文化转化为可观看、可参与</w:t>
+      </w:r>
+      <w:r>
+        <w:rPr>
+          <w:rFonts w:hint="eastAsia"/>
+          <w:lang w:eastAsia="zh-CN"/>
+        </w:rPr>
+        <w:t>、</w:t>
+      </w:r>
+      <w:r>
+        <w:rPr>
+          <w:lang w:eastAsia="zh-CN"/>
+        </w:rPr>
+        <w:t>可分享的体验，扩大了青年受众。不过，传播效率不能替代知识深度，展示仍需补充历史解释、技艺流程和传承主体。</w:t>
+      </w:r>
+    </w:p>
+    <w:p>
+      <w:pPr>
+        <w:pStyle w:val="2"/>
+        <w:spacing w:line="240" w:lineRule="auto"/>
+        <w:rPr>
+          <w:lang w:eastAsia="zh-CN"/>
+        </w:rPr>
+      </w:pPr>
+      <w:r>
+        <w:rPr>
+          <w:lang w:eastAsia="zh-CN"/>
+        </w:rPr>
+        <w:lastRenderedPageBreak/>
+        <w:t>（三）</w:t>
+      </w:r>
+      <w:proofErr w:type="gramStart"/>
+      <w:r>
+        <w:rPr>
+          <w:lang w:eastAsia="zh-CN"/>
+        </w:rPr>
+        <w:t>文旅融合</w:t>
+      </w:r>
+      <w:proofErr w:type="gramEnd"/>
+      <w:r>
+        <w:rPr>
+          <w:lang w:eastAsia="zh-CN"/>
+        </w:rPr>
+        <w:t>提升活力，也带来同质化风险</w:t>
+      </w:r>
+    </w:p>
+    <w:p>
+      <w:pPr>
+        <w:ind w:firstLine="480"/>
+        <w:rPr>
+          <w:lang w:eastAsia="zh-CN"/>
+        </w:rPr>
+      </w:pPr>
+      <w:r>
+        <w:rPr>
+          <w:lang w:eastAsia="zh-CN"/>
+        </w:rPr>
+        <w:t>客流为餐饮、手工艺和文化服务创造市场，并推动环境改善；与此同时，标准化消费业</w:t>
+      </w:r>
+      <w:proofErr w:type="gramStart"/>
+      <w:r>
+        <w:rPr>
+          <w:lang w:eastAsia="zh-CN"/>
+        </w:rPr>
+        <w:t>态可能</w:t>
+      </w:r>
+      <w:proofErr w:type="gramEnd"/>
+      <w:r>
+        <w:rPr>
+          <w:lang w:eastAsia="zh-CN"/>
+        </w:rPr>
+        <w:t>挤压地方特色，使不同城市的历史街区趋于相似。判断活化是否成功，不能只看客流和社交媒体热度，还要观察原创文化项目、公共服务和社区受益程度。</w:t>
+      </w:r>
+    </w:p>
+    <w:p>
+      <w:pPr>
+        <w:pStyle w:val="2"/>
+        <w:spacing w:line="240" w:lineRule="auto"/>
+        <w:rPr>
+          <w:lang w:eastAsia="zh-CN"/>
+        </w:rPr>
+      </w:pPr>
+      <w:r>
+        <w:rPr>
+          <w:lang w:eastAsia="zh-CN"/>
+        </w:rPr>
+        <w:t>（四）公共性是可持续更新的重要尺度</w:t>
+      </w:r>
+    </w:p>
+    <w:p>
+      <w:pPr>
+        <w:ind w:firstLine="480"/>
+        <w:rPr>
+          <w:lang w:eastAsia="zh-CN"/>
+        </w:rPr>
+      </w:pPr>
+      <w:r>
+        <w:rPr>
+          <w:lang w:eastAsia="zh-CN"/>
+        </w:rPr>
+        <w:t>永庆坊既是旅游目的地，也属于城市日常生活的一部分。桥梁、街道和滨河空间的开放性</w:t>
+      </w:r>
+      <w:r>
+        <w:rPr>
+          <w:rFonts w:hint="eastAsia"/>
+          <w:lang w:eastAsia="zh-CN"/>
+        </w:rPr>
+        <w:t>提升了商业</w:t>
+      </w:r>
+      <w:r>
+        <w:rPr>
+          <w:lang w:eastAsia="zh-CN"/>
+        </w:rPr>
+        <w:t>价值</w:t>
+      </w:r>
+      <w:r>
+        <w:rPr>
+          <w:rFonts w:hint="eastAsia"/>
+          <w:lang w:eastAsia="zh-CN"/>
+        </w:rPr>
+        <w:t>，但也占据了公共空间</w:t>
+      </w:r>
+      <w:r>
+        <w:rPr>
+          <w:lang w:eastAsia="zh-CN"/>
+        </w:rPr>
+        <w:t>。未来管理应继续协调游客体验、商业经营与社区使用，避免</w:t>
+      </w:r>
+      <w:r>
+        <w:rPr>
+          <w:rFonts w:hint="eastAsia"/>
+          <w:lang w:eastAsia="zh-CN"/>
+        </w:rPr>
+        <w:t>原住民</w:t>
+      </w:r>
+      <w:r>
+        <w:rPr>
+          <w:lang w:eastAsia="zh-CN"/>
+        </w:rPr>
+        <w:t>公共空间被</w:t>
+      </w:r>
+      <w:r>
+        <w:rPr>
+          <w:rFonts w:hint="eastAsia"/>
+          <w:lang w:eastAsia="zh-CN"/>
+        </w:rPr>
+        <w:t>大量浅薄的</w:t>
+      </w:r>
+      <w:r>
+        <w:rPr>
+          <w:rFonts w:hint="eastAsia"/>
+          <w:lang w:eastAsia="zh-CN"/>
+        </w:rPr>
+        <w:t>商业</w:t>
+      </w:r>
+      <w:r>
+        <w:rPr>
+          <w:lang w:eastAsia="zh-CN"/>
+        </w:rPr>
+        <w:t>活动</w:t>
+      </w:r>
+      <w:r>
+        <w:rPr>
+          <w:rFonts w:hint="eastAsia"/>
+          <w:lang w:eastAsia="zh-CN"/>
+        </w:rPr>
+        <w:t>影响</w:t>
+      </w:r>
+      <w:r>
+        <w:rPr>
+          <w:lang w:eastAsia="zh-CN"/>
+        </w:rPr>
+        <w:t>。</w:t>
       </w:r>
     </w:p>
     <w:p>
@@ -1746,29 +2509,16 @@
         <w:pBdr>
           <w:bottom w:val="single" w:sz="8" w:space="4" w:color="7086E8"/>
         </w:pBdr>
-        <w:rPr>
-          <w:lang w:eastAsia="zh-CN"/>
-        </w:rPr>
-      </w:pPr>
-      <w:r>
-        <w:rPr>
-          <w:lang w:eastAsia="zh-CN"/>
-        </w:rPr>
-        <w:t>六、实践发现与结果分析</w:t>
-      </w:r>
-    </w:p>
-    <w:p>
-      <w:pPr>
-        <w:pStyle w:val="2"/>
-        <w:rPr>
-          <w:lang w:eastAsia="zh-CN"/>
-        </w:rPr>
-      </w:pPr>
-      <w:r>
-        <w:rPr>
-          <w:lang w:eastAsia="zh-CN"/>
-        </w:rPr>
-        <w:t>（一）历史建筑保护与功能更新形成协同</w:t>
+        <w:spacing w:line="240" w:lineRule="auto"/>
+        <w:rPr>
+          <w:lang w:eastAsia="zh-CN"/>
+        </w:rPr>
+      </w:pPr>
+      <w:r>
+        <w:rPr>
+          <w:lang w:eastAsia="zh-CN"/>
+        </w:rPr>
+        <w:t>七、永庆坊实践的广东经验</w:t>
       </w:r>
     </w:p>
     <w:p>
@@ -1782,170 +2532,97 @@
         <w:rPr>
           <w:lang w:eastAsia="zh-CN"/>
         </w:rPr>
-        <w:t>骑楼街道和传统立面保存了可辨认的历史空间，新的展览、商业和服务功能则提高了建筑使用率。其核心不是把旧建筑冻结，而是在不破坏主要风貌的前提下赋予持续使用价值，体现了广东城市更新从单纯追求建设速度转向重视文化品质。</w:t>
-      </w:r>
-    </w:p>
-    <w:p>
-      <w:pPr>
-        <w:pStyle w:val="2"/>
-        <w:rPr>
-          <w:lang w:eastAsia="zh-CN"/>
-        </w:rPr>
-      </w:pPr>
-      <w:r>
-        <w:rPr>
-          <w:lang w:eastAsia="zh-CN"/>
-        </w:rPr>
-        <w:lastRenderedPageBreak/>
-        <w:t>（二）岭南文化传播方式更加年轻化</w:t>
-      </w:r>
-    </w:p>
-    <w:p>
-      <w:pPr>
-        <w:ind w:firstLine="480"/>
-        <w:rPr>
-          <w:lang w:eastAsia="zh-CN"/>
-        </w:rPr>
-      </w:pPr>
-      <w:r>
-        <w:rPr>
-          <w:lang w:eastAsia="zh-CN"/>
-        </w:rPr>
-        <w:t>粤剧舞台、服饰纹样、</w:t>
-      </w:r>
-      <w:proofErr w:type="gramStart"/>
-      <w:r>
-        <w:rPr>
-          <w:lang w:eastAsia="zh-CN"/>
-        </w:rPr>
-        <w:t>墙绘和文创设计把</w:t>
-      </w:r>
-      <w:proofErr w:type="gramEnd"/>
-      <w:r>
-        <w:rPr>
-          <w:lang w:eastAsia="zh-CN"/>
-        </w:rPr>
-        <w:t>抽象文化转化为可观看、可参与和</w:t>
-      </w:r>
-      <w:proofErr w:type="gramStart"/>
-      <w:r>
-        <w:rPr>
-          <w:lang w:eastAsia="zh-CN"/>
-        </w:rPr>
-        <w:t>可</w:t>
-      </w:r>
-      <w:proofErr w:type="gramEnd"/>
-      <w:r>
-        <w:rPr>
-          <w:lang w:eastAsia="zh-CN"/>
-        </w:rPr>
-        <w:t>分享的体验，扩大了青年受众。不过，传播效率不能替代知识深度，展示仍需补充历史解释、技艺流程和传承主体。</w:t>
-      </w:r>
-    </w:p>
-    <w:p>
-      <w:pPr>
-        <w:pStyle w:val="2"/>
-        <w:rPr>
-          <w:lang w:eastAsia="zh-CN"/>
-        </w:rPr>
-      </w:pPr>
-      <w:r>
-        <w:rPr>
-          <w:lang w:eastAsia="zh-CN"/>
-        </w:rPr>
-        <w:t>（三）</w:t>
-      </w:r>
-      <w:proofErr w:type="gramStart"/>
-      <w:r>
-        <w:rPr>
-          <w:lang w:eastAsia="zh-CN"/>
-        </w:rPr>
-        <w:t>文旅融合</w:t>
-      </w:r>
-      <w:proofErr w:type="gramEnd"/>
-      <w:r>
-        <w:rPr>
-          <w:lang w:eastAsia="zh-CN"/>
-        </w:rPr>
-        <w:t>提升活力，也带来同质化风险</w:t>
-      </w:r>
-    </w:p>
-    <w:p>
-      <w:pPr>
-        <w:ind w:firstLine="480"/>
-        <w:rPr>
-          <w:lang w:eastAsia="zh-CN"/>
-        </w:rPr>
-      </w:pPr>
-      <w:r>
-        <w:rPr>
-          <w:lang w:eastAsia="zh-CN"/>
-        </w:rPr>
-        <w:t>客流为餐饮、手工艺和文化服务创造市场，并推动环境改善；与此同时，标准化消费业</w:t>
-      </w:r>
-      <w:proofErr w:type="gramStart"/>
-      <w:r>
-        <w:rPr>
-          <w:lang w:eastAsia="zh-CN"/>
-        </w:rPr>
-        <w:t>态可能</w:t>
-      </w:r>
-      <w:proofErr w:type="gramEnd"/>
-      <w:r>
-        <w:rPr>
-          <w:lang w:eastAsia="zh-CN"/>
-        </w:rPr>
-        <w:t>挤压地方特色，使不同城市的历史街区趋于相似。判断活化是否成功，不能只看客流和社交媒体热度，还要观察原创文化项目、公共服务和社区受益程度。</w:t>
-      </w:r>
-    </w:p>
-    <w:p>
-      <w:pPr>
-        <w:pStyle w:val="2"/>
-        <w:rPr>
-          <w:lang w:eastAsia="zh-CN"/>
-        </w:rPr>
-      </w:pPr>
-      <w:r>
-        <w:rPr>
-          <w:lang w:eastAsia="zh-CN"/>
-        </w:rPr>
-        <w:t>（四）公共性是可持续更新的重要尺度</w:t>
-      </w:r>
-    </w:p>
-    <w:p>
-      <w:pPr>
-        <w:ind w:firstLine="480"/>
-        <w:rPr>
-          <w:lang w:eastAsia="zh-CN"/>
-        </w:rPr>
-      </w:pPr>
-      <w:proofErr w:type="gramStart"/>
-      <w:r>
-        <w:rPr>
-          <w:lang w:eastAsia="zh-CN"/>
-        </w:rPr>
-        <w:t>永庆坊既是</w:t>
-      </w:r>
-      <w:proofErr w:type="gramEnd"/>
-      <w:r>
-        <w:rPr>
-          <w:lang w:eastAsia="zh-CN"/>
-        </w:rPr>
-        <w:t>旅游目的地，也属于城市日常生活的一部分。桥梁、街道和滨河空间的开放性提升了公共价值。未来管理应继续协调游客体验、商业经营与社区使用，避免公共空间被单</w:t>
-      </w:r>
-      <w:proofErr w:type="gramStart"/>
-      <w:r>
-        <w:rPr>
-          <w:lang w:eastAsia="zh-CN"/>
-        </w:rPr>
-        <w:t>一</w:t>
-      </w:r>
-      <w:proofErr w:type="gramEnd"/>
-      <w:r>
-        <w:rPr>
-          <w:lang w:eastAsia="zh-CN"/>
-        </w:rPr>
-        <w:t>消费活动占据。</w:t>
+        <w:t>永庆坊的经验可概括为四点：</w:t>
+      </w:r>
+    </w:p>
+    <w:p>
+      <w:pPr>
+        <w:pStyle w:val="af"/>
+        <w:numPr>
+          <w:ilvl w:val="0"/>
+          <w:numId w:val="6"/>
+        </w:numPr>
+        <w:ind w:firstLineChars="0"/>
+        <w:rPr>
+          <w:lang w:eastAsia="zh-CN"/>
+        </w:rPr>
+      </w:pPr>
+      <w:r>
+        <w:rPr>
+          <w:lang w:eastAsia="zh-CN"/>
+        </w:rPr>
+        <w:t>保护优先，以渐进修缮</w:t>
+      </w:r>
+      <w:r>
+        <w:rPr>
+          <w:rFonts w:hint="eastAsia"/>
+          <w:lang w:eastAsia="zh-CN"/>
+        </w:rPr>
+        <w:t>代替推倒重建</w:t>
+      </w:r>
+      <w:r>
+        <w:rPr>
+          <w:lang w:eastAsia="zh-CN"/>
+        </w:rPr>
+        <w:t>；</w:t>
+      </w:r>
+    </w:p>
+    <w:p>
+      <w:pPr>
+        <w:pStyle w:val="af"/>
+        <w:numPr>
+          <w:ilvl w:val="0"/>
+          <w:numId w:val="6"/>
+        </w:numPr>
+        <w:ind w:firstLineChars="0"/>
+        <w:rPr>
+          <w:lang w:eastAsia="zh-CN"/>
+        </w:rPr>
+      </w:pPr>
+      <w:r>
+        <w:rPr>
+          <w:lang w:eastAsia="zh-CN"/>
+        </w:rPr>
+        <w:t>活化利用，通过文化场馆、公共空间和适度商业让老建筑持续使用；</w:t>
+      </w:r>
+    </w:p>
+    <w:p>
+      <w:pPr>
+        <w:pStyle w:val="af"/>
+        <w:numPr>
+          <w:ilvl w:val="0"/>
+          <w:numId w:val="6"/>
+        </w:numPr>
+        <w:ind w:firstLineChars="0"/>
+        <w:rPr>
+          <w:lang w:eastAsia="zh-CN"/>
+        </w:rPr>
+      </w:pPr>
+      <w:r>
+        <w:rPr>
+          <w:lang w:eastAsia="zh-CN"/>
+        </w:rPr>
+        <w:t>突出岭南特色，以粤剧和传统工艺建立区别于一般商业街的文化主题；</w:t>
+      </w:r>
+    </w:p>
+    <w:p>
+      <w:pPr>
+        <w:pStyle w:val="af"/>
+        <w:numPr>
+          <w:ilvl w:val="0"/>
+          <w:numId w:val="6"/>
+        </w:numPr>
+        <w:ind w:firstLineChars="0"/>
+        <w:rPr>
+          <w:rFonts w:hint="eastAsia"/>
+          <w:lang w:eastAsia="zh-CN"/>
+        </w:rPr>
+      </w:pPr>
+      <w:r>
+        <w:rPr>
+          <w:lang w:eastAsia="zh-CN"/>
+        </w:rPr>
+        <w:t>利用数字传播扩大影响，使历史街区成为青年认识地方文化的入口。</w:t>
       </w:r>
     </w:p>
     <w:p>
@@ -1954,51 +2631,152 @@
         <w:pBdr>
           <w:bottom w:val="single" w:sz="8" w:space="4" w:color="7086E8"/>
         </w:pBdr>
-        <w:rPr>
-          <w:lang w:eastAsia="zh-CN"/>
-        </w:rPr>
-      </w:pPr>
-      <w:r>
-        <w:rPr>
-          <w:lang w:eastAsia="zh-CN"/>
-        </w:rPr>
-        <w:t>七、永</w:t>
+        <w:spacing w:line="240" w:lineRule="auto"/>
+        <w:rPr>
+          <w:lang w:eastAsia="zh-CN"/>
+        </w:rPr>
+      </w:pPr>
+      <w:r>
+        <w:rPr>
+          <w:lang w:eastAsia="zh-CN"/>
+        </w:rPr>
+        <w:t>八、存在的问题</w:t>
+      </w:r>
+    </w:p>
+    <w:p>
+      <w:pPr>
+        <w:pStyle w:val="af"/>
+        <w:numPr>
+          <w:ilvl w:val="0"/>
+          <w:numId w:val="3"/>
+        </w:numPr>
+        <w:ind w:firstLineChars="0"/>
+        <w:rPr>
+          <w:lang w:eastAsia="zh-CN"/>
+        </w:rPr>
+      </w:pPr>
+      <w:r>
+        <w:rPr>
+          <w:lang w:eastAsia="zh-CN"/>
+        </w:rPr>
+        <w:t>部分文化元素偏重视觉装饰，知识解释和技艺过程</w:t>
       </w:r>
       <w:proofErr w:type="gramStart"/>
       <w:r>
         <w:rPr>
           <w:lang w:eastAsia="zh-CN"/>
         </w:rPr>
-        <w:t>庆坊实践</w:t>
+        <w:t>展示仍</w:t>
       </w:r>
       <w:proofErr w:type="gramEnd"/>
       <w:r>
         <w:rPr>
           <w:lang w:eastAsia="zh-CN"/>
         </w:rPr>
-        <w:t>的广东经验</w:t>
-      </w:r>
-    </w:p>
-    <w:p>
-      <w:pPr>
-        <w:ind w:firstLine="480"/>
-        <w:rPr>
-          <w:lang w:eastAsia="zh-CN"/>
-        </w:rPr>
-      </w:pPr>
+        <w:t>显不足。</w:t>
+      </w:r>
+    </w:p>
+    <w:p>
+      <w:pPr>
+        <w:pStyle w:val="af"/>
+        <w:numPr>
+          <w:ilvl w:val="0"/>
+          <w:numId w:val="3"/>
+        </w:numPr>
+        <w:ind w:firstLineChars="0"/>
+        <w:rPr>
+          <w:lang w:eastAsia="zh-CN"/>
+        </w:rPr>
+      </w:pPr>
+      <w:r>
+        <w:rPr>
+          <w:lang w:eastAsia="zh-CN"/>
+        </w:rPr>
+        <w:t>热门消费业</w:t>
+      </w:r>
       <w:proofErr w:type="gramStart"/>
       <w:r>
         <w:rPr>
           <w:lang w:eastAsia="zh-CN"/>
         </w:rPr>
-        <w:t>永庆坊的</w:t>
+        <w:t>态可能</w:t>
       </w:r>
       <w:proofErr w:type="gramEnd"/>
       <w:r>
         <w:rPr>
           <w:lang w:eastAsia="zh-CN"/>
         </w:rPr>
-        <w:t>经验可概括为四点：一是保护优先，以渐进修缮维持街巷肌理；二是活化利用，通过文化场馆、公共空间和适度商业让老建筑持续使用；三是突出岭南特色，以粤剧和传统工艺建立区别于一般商业街的文化主题；四是利用数字传播扩大影响，使历史街区成为青年认识地方文化的入口。这说明“走在前列”不仅体现为经济和技术发展，也体现为对城市现代化与历史文脉关系的主动探索。</w:t>
+        <w:t>形成同质化，削弱街区的地方性。</w:t>
+      </w:r>
+    </w:p>
+    <w:p>
+      <w:pPr>
+        <w:pStyle w:val="af"/>
+        <w:numPr>
+          <w:ilvl w:val="0"/>
+          <w:numId w:val="3"/>
+        </w:numPr>
+        <w:ind w:firstLineChars="0"/>
+        <w:rPr>
+          <w:lang w:eastAsia="zh-CN"/>
+        </w:rPr>
+      </w:pPr>
+      <w:r>
+        <w:rPr>
+          <w:lang w:eastAsia="zh-CN"/>
+        </w:rPr>
+        <w:t>照片能够呈现游客与公共空间，却不足以证明居民、商户和工作人员的真实感受，后续调研需要补足多主体访谈。</w:t>
+      </w:r>
+    </w:p>
+    <w:p>
+      <w:pPr>
+        <w:pStyle w:val="af"/>
+        <w:numPr>
+          <w:ilvl w:val="0"/>
+          <w:numId w:val="3"/>
+        </w:numPr>
+        <w:ind w:firstLineChars="0"/>
+        <w:rPr>
+          <w:lang w:eastAsia="zh-CN"/>
+        </w:rPr>
+      </w:pPr>
+      <w:r>
+        <w:rPr>
+          <w:lang w:eastAsia="zh-CN"/>
+        </w:rPr>
+        <w:t>更新前后的社会影响缺少连续数据，不能仅凭环境变美就判断所有群体均同等受益。</w:t>
+      </w:r>
+    </w:p>
+    <w:p>
+      <w:pPr>
+        <w:pStyle w:val="af"/>
+        <w:numPr>
+          <w:ilvl w:val="0"/>
+          <w:numId w:val="3"/>
+        </w:numPr>
+        <w:ind w:firstLineChars="0"/>
+        <w:rPr>
+          <w:lang w:eastAsia="zh-CN"/>
+        </w:rPr>
+      </w:pPr>
+      <w:r>
+        <w:rPr>
+          <w:lang w:eastAsia="zh-CN"/>
+        </w:rPr>
+        <w:t>旅游热度增加后，客流、噪声和社区</w:t>
+      </w:r>
+      <w:r>
+        <w:rPr>
+          <w:rFonts w:hint="eastAsia"/>
+          <w:lang w:eastAsia="zh-CN"/>
+        </w:rPr>
+        <w:t>居民</w:t>
+      </w:r>
+      <w:r>
+        <w:rPr>
+          <w:lang w:eastAsia="zh-CN"/>
+        </w:rPr>
+        <w:t>生活之间的协调需要长期治理。</w:t>
       </w:r>
     </w:p>
     <w:p>
@@ -2007,64 +2785,154 @@
         <w:pBdr>
           <w:bottom w:val="single" w:sz="8" w:space="4" w:color="7086E8"/>
         </w:pBdr>
-        <w:rPr>
-          <w:lang w:eastAsia="zh-CN"/>
-        </w:rPr>
-      </w:pPr>
-      <w:r>
-        <w:rPr>
-          <w:lang w:eastAsia="zh-CN"/>
-        </w:rPr>
-        <w:t>八、存在的问题</w:t>
-      </w:r>
-    </w:p>
-    <w:p>
-      <w:pPr>
-        <w:ind w:firstLine="480"/>
-        <w:rPr>
-          <w:lang w:eastAsia="zh-CN"/>
-        </w:rPr>
-      </w:pPr>
-      <w:r>
-        <w:rPr>
-          <w:lang w:eastAsia="zh-CN"/>
-        </w:rPr>
-        <w:t>第一，部分文化元素偏重视觉装饰，知识解释和技艺过程</w:t>
+        <w:spacing w:line="240" w:lineRule="auto"/>
+        <w:rPr>
+          <w:lang w:eastAsia="zh-CN"/>
+        </w:rPr>
+      </w:pPr>
+      <w:r>
+        <w:rPr>
+          <w:lang w:eastAsia="zh-CN"/>
+        </w:rPr>
+        <w:lastRenderedPageBreak/>
+        <w:t>九、对未来发展的建议</w:t>
+      </w:r>
+    </w:p>
+    <w:p>
+      <w:pPr>
+        <w:pStyle w:val="af"/>
+        <w:numPr>
+          <w:ilvl w:val="0"/>
+          <w:numId w:val="5"/>
+        </w:numPr>
+        <w:ind w:firstLineChars="0"/>
+        <w:rPr>
+          <w:lang w:eastAsia="zh-CN"/>
+        </w:rPr>
+      </w:pPr>
+      <w:r>
+        <w:rPr>
+          <w:lang w:eastAsia="zh-CN"/>
+        </w:rPr>
+        <w:t>提高文化解释深度，在建筑和非</w:t>
       </w:r>
       <w:proofErr w:type="gramStart"/>
       <w:r>
         <w:rPr>
           <w:lang w:eastAsia="zh-CN"/>
         </w:rPr>
-        <w:t>展示仍</w:t>
+        <w:t>遗展示</w:t>
       </w:r>
       <w:proofErr w:type="gramEnd"/>
       <w:r>
         <w:rPr>
           <w:lang w:eastAsia="zh-CN"/>
         </w:rPr>
-        <w:t>显不足。第二，热门消费业</w:t>
+        <w:t>中增加口述历史、制作流程、传承人故事与多语种数字导</w:t>
       </w:r>
       <w:proofErr w:type="gramStart"/>
       <w:r>
         <w:rPr>
           <w:lang w:eastAsia="zh-CN"/>
         </w:rPr>
-        <w:t>态可能</w:t>
+        <w:t>览</w:t>
       </w:r>
       <w:proofErr w:type="gramEnd"/>
       <w:r>
         <w:rPr>
           <w:lang w:eastAsia="zh-CN"/>
         </w:rPr>
-        <w:t>形成同质化，削弱街区的地方性。第三，照片能够呈现游客与公共空间，却不足以证明居民、商户和工作人员的真实感受，后续调研需要补足多主体访谈。第四，更新前后</w:t>
-      </w:r>
-      <w:r>
-        <w:rPr>
-          <w:lang w:eastAsia="zh-CN"/>
-        </w:rPr>
-        <w:lastRenderedPageBreak/>
-        <w:t>的社会影响缺少连续数据，不能仅凭环境变美就判断所有群体均同等受益。第五，夜间活动与旅游热度增加后，客流、噪声和社区生活之间的协调需要长期治理。</w:t>
+        <w:t>。</w:t>
+      </w:r>
+    </w:p>
+    <w:p>
+      <w:pPr>
+        <w:pStyle w:val="af"/>
+        <w:numPr>
+          <w:ilvl w:val="0"/>
+          <w:numId w:val="5"/>
+        </w:numPr>
+        <w:ind w:firstLineChars="0"/>
+        <w:rPr>
+          <w:lang w:eastAsia="zh-CN"/>
+        </w:rPr>
+      </w:pPr>
+      <w:r>
+        <w:rPr>
+          <w:lang w:eastAsia="zh-CN"/>
+        </w:rPr>
+        <w:t>控制商业同质化，优先支持本地老字号、</w:t>
+      </w:r>
+      <w:proofErr w:type="gramStart"/>
+      <w:r>
+        <w:rPr>
+          <w:lang w:eastAsia="zh-CN"/>
+        </w:rPr>
+        <w:t>原创文</w:t>
+      </w:r>
+      <w:proofErr w:type="gramEnd"/>
+      <w:r>
+        <w:rPr>
+          <w:lang w:eastAsia="zh-CN"/>
+        </w:rPr>
+        <w:t>创和能够展示真实生产过程的非遗项目。</w:t>
+      </w:r>
+    </w:p>
+    <w:p>
+      <w:pPr>
+        <w:pStyle w:val="af"/>
+        <w:numPr>
+          <w:ilvl w:val="0"/>
+          <w:numId w:val="5"/>
+        </w:numPr>
+        <w:ind w:firstLineChars="0"/>
+        <w:rPr>
+          <w:lang w:eastAsia="zh-CN"/>
+        </w:rPr>
+      </w:pPr>
+      <w:r>
+        <w:rPr>
+          <w:lang w:eastAsia="zh-CN"/>
+        </w:rPr>
+        <w:t>完善居民参与，通过社区议事、定期问卷和经营者座谈，让不同群体参与活动安排和公共空间管理。</w:t>
+      </w:r>
+    </w:p>
+    <w:p>
+      <w:pPr>
+        <w:pStyle w:val="af"/>
+        <w:numPr>
+          <w:ilvl w:val="0"/>
+          <w:numId w:val="5"/>
+        </w:numPr>
+        <w:ind w:firstLineChars="0"/>
+        <w:rPr>
+          <w:lang w:eastAsia="zh-CN"/>
+        </w:rPr>
+      </w:pPr>
+      <w:r>
+        <w:rPr>
+          <w:lang w:eastAsia="zh-CN"/>
+        </w:rPr>
+        <w:t>建立持续评估机制，同步关注文化项目质量、居民满意度、公共空间和原创业态比例。</w:t>
+      </w:r>
+    </w:p>
+    <w:p>
+      <w:pPr>
+        <w:pStyle w:val="af"/>
+        <w:numPr>
+          <w:ilvl w:val="0"/>
+          <w:numId w:val="5"/>
+        </w:numPr>
+        <w:ind w:firstLineChars="0"/>
+        <w:rPr>
+          <w:lang w:eastAsia="zh-CN"/>
+        </w:rPr>
+      </w:pPr>
+      <w:r>
+        <w:rPr>
+          <w:lang w:eastAsia="zh-CN"/>
+        </w:rPr>
+        <w:t>扩大青年参与，组织志愿讲解、影像记录和数字档案建设，使青年从文化消费者转变为传播者和保护参与者。</w:t>
       </w:r>
     </w:p>
     <w:p>
@@ -2073,15 +2941,16 @@
         <w:pBdr>
           <w:bottom w:val="single" w:sz="8" w:space="4" w:color="7086E8"/>
         </w:pBdr>
-        <w:rPr>
-          <w:lang w:eastAsia="zh-CN"/>
-        </w:rPr>
-      </w:pPr>
-      <w:r>
-        <w:rPr>
-          <w:lang w:eastAsia="zh-CN"/>
-        </w:rPr>
-        <w:t>九、对未来发展的建议</w:t>
+        <w:spacing w:line="240" w:lineRule="auto"/>
+        <w:rPr>
+          <w:lang w:eastAsia="zh-CN"/>
+        </w:rPr>
+      </w:pPr>
+      <w:r>
+        <w:rPr>
+          <w:lang w:eastAsia="zh-CN"/>
+        </w:rPr>
+        <w:t>十、实践心得体会</w:t>
       </w:r>
     </w:p>
     <w:p>
@@ -2095,565 +2964,12 @@
         <w:rPr>
           <w:lang w:eastAsia="zh-CN"/>
         </w:rPr>
-        <w:t>一是提高文化解释深度，在建筑和非</w:t>
-      </w:r>
-      <w:proofErr w:type="gramStart"/>
-      <w:r>
-        <w:rPr>
-          <w:lang w:eastAsia="zh-CN"/>
-        </w:rPr>
-        <w:t>遗展示</w:t>
-      </w:r>
-      <w:proofErr w:type="gramEnd"/>
-      <w:r>
-        <w:rPr>
-          <w:lang w:eastAsia="zh-CN"/>
-        </w:rPr>
-        <w:t>中增加口述历史、制作流程、传承人故事与多语种数字导</w:t>
-      </w:r>
-      <w:proofErr w:type="gramStart"/>
-      <w:r>
-        <w:rPr>
-          <w:lang w:eastAsia="zh-CN"/>
-        </w:rPr>
-        <w:t>览</w:t>
-      </w:r>
-      <w:proofErr w:type="gramEnd"/>
-      <w:r>
-        <w:rPr>
-          <w:lang w:eastAsia="zh-CN"/>
-        </w:rPr>
-        <w:t>。二是控制商业同质化，优先支持本地老字号、</w:t>
-      </w:r>
-      <w:proofErr w:type="gramStart"/>
-      <w:r>
-        <w:rPr>
-          <w:lang w:eastAsia="zh-CN"/>
-        </w:rPr>
-        <w:t>原创文</w:t>
-      </w:r>
-      <w:proofErr w:type="gramEnd"/>
-      <w:r>
-        <w:rPr>
-          <w:lang w:eastAsia="zh-CN"/>
-        </w:rPr>
-        <w:t>创和能够展示真实生产过程的非遗项目。三是完善居民参与，通过社区议事、定期问卷和经营者座谈，让不同群体参与活动安排和公共空间管理。四是建立持续评估机制，除客流外同步关注文化项目质量、居民满意度、公共空间可达性和原创业态比例。五是扩大青年参与，组织志愿讲解、影像记录和数字档案建设，使青年从文化消费者转变为传播者和保护参与者。</w:t>
-      </w:r>
-    </w:p>
-    <w:p>
-      <w:pPr>
-        <w:pStyle w:val="1"/>
-        <w:pBdr>
-          <w:bottom w:val="single" w:sz="8" w:space="4" w:color="7086E8"/>
-        </w:pBdr>
-        <w:rPr>
-          <w:lang w:eastAsia="zh-CN"/>
-        </w:rPr>
-      </w:pPr>
-      <w:r>
-        <w:rPr>
-          <w:lang w:eastAsia="zh-CN"/>
-        </w:rPr>
-        <w:t>十、实践心得体会</w:t>
-      </w:r>
-    </w:p>
-    <w:p>
-      <w:pPr>
-        <w:ind w:firstLine="480"/>
-        <w:rPr>
-          <w:lang w:eastAsia="zh-CN"/>
-        </w:rPr>
-      </w:pPr>
-      <w:r>
-        <w:rPr>
-          <w:lang w:eastAsia="zh-CN"/>
-        </w:rPr>
-        <w:t>通过本次观察，我认识到传统文化保护并不是保存几栋旧建筑，也不是简单增加传统符号，而是让建筑、技艺与社区关系在现代城市中继续发挥作用。</w:t>
-      </w:r>
-      <w:proofErr w:type="gramStart"/>
-      <w:r>
-        <w:rPr>
-          <w:lang w:eastAsia="zh-CN"/>
-        </w:rPr>
-        <w:t>永庆坊的</w:t>
-      </w:r>
-      <w:proofErr w:type="gramEnd"/>
-      <w:r>
-        <w:rPr>
-          <w:lang w:eastAsia="zh-CN"/>
-        </w:rPr>
-        <w:t>骑楼、粤剧空间和滨河景观说明，文化遗产可以通过合理更新重新进入公众生活；商业和数字传播也确实能够提高可见度。但文化价值不能只由“是否适合打卡”衡量，真正可持续的更新还应尊重历史真实性、传承人的劳动和社区日常需求。作为青年学生，我们既要主动了解文化背后的知识，也应在引用图片、访谈和网络资料时保持诚实，以可靠记录参与岭南文化传播。</w:t>
-      </w:r>
-    </w:p>
-    <w:p>
-      <w:pPr>
-        <w:pStyle w:val="1"/>
-        <w:pBdr>
-          <w:bottom w:val="single" w:sz="8" w:space="4" w:color="7086E8"/>
-        </w:pBdr>
-        <w:rPr>
-          <w:lang w:eastAsia="zh-CN"/>
-        </w:rPr>
-      </w:pPr>
-      <w:r>
-        <w:rPr>
-          <w:lang w:eastAsia="zh-CN"/>
-        </w:rPr>
-        <w:t>十一、附件</w:t>
-      </w:r>
-    </w:p>
-    <w:p>
-      <w:pPr>
-        <w:pStyle w:val="2"/>
-        <w:rPr>
-          <w:lang w:eastAsia="zh-CN"/>
-        </w:rPr>
-      </w:pPr>
-      <w:r>
-        <w:rPr>
-          <w:lang w:eastAsia="zh-CN"/>
-        </w:rPr>
-        <w:t>附件一：访谈补充记录表</w:t>
-      </w:r>
-    </w:p>
-    <w:tbl>
-      <w:tblPr>
-        <w:tblW w:w="0" w:type="auto"/>
-        <w:tblLayout w:type="fixed"/>
-        <w:tblLook w:val="04A0" w:firstRow="1" w:lastRow="0" w:firstColumn="1" w:lastColumn="0" w:noHBand="0" w:noVBand="1"/>
-      </w:tblPr>
-      <w:tblGrid>
-        <w:gridCol w:w="2426"/>
-        <w:gridCol w:w="2426"/>
-        <w:gridCol w:w="2426"/>
-        <w:gridCol w:w="2426"/>
-      </w:tblGrid>
-      <w:tr>
-        <w:trPr>
-          <w:tblHeader/>
-        </w:trPr>
-        <w:tc>
-          <w:tcPr>
-            <w:tcW w:w="2426" w:type="dxa"/>
-            <w:shd w:val="clear" w:color="auto" w:fill="172B78"/>
-          </w:tcPr>
-          <w:p>
-            <w:proofErr w:type="spellStart"/>
-            <w:r>
-              <w:rPr>
-                <w:b/>
-                <w:color w:val="FFFFFF"/>
-                <w:sz w:val="18"/>
-              </w:rPr>
-              <w:t>对象类别</w:t>
-            </w:r>
-            <w:proofErr w:type="spellEnd"/>
-          </w:p>
-        </w:tc>
-        <w:tc>
-          <w:tcPr>
-            <w:tcW w:w="2426" w:type="dxa"/>
-            <w:shd w:val="clear" w:color="auto" w:fill="172B78"/>
-          </w:tcPr>
-          <w:p>
-            <w:r>
-              <w:rPr>
-                <w:b/>
-                <w:color w:val="FFFFFF"/>
-                <w:sz w:val="18"/>
-              </w:rPr>
-              <w:t>时间与地点</w:t>
-            </w:r>
-          </w:p>
-        </w:tc>
-        <w:tc>
-          <w:tcPr>
-            <w:tcW w:w="2426" w:type="dxa"/>
-            <w:shd w:val="clear" w:color="auto" w:fill="172B78"/>
-          </w:tcPr>
-          <w:p>
-            <w:r>
-              <w:rPr>
-                <w:b/>
-                <w:color w:val="FFFFFF"/>
-                <w:sz w:val="18"/>
-              </w:rPr>
-              <w:t>核心回答摘要</w:t>
-            </w:r>
-          </w:p>
-        </w:tc>
-        <w:tc>
-          <w:tcPr>
-            <w:tcW w:w="2426" w:type="dxa"/>
-            <w:shd w:val="clear" w:color="auto" w:fill="172B78"/>
-          </w:tcPr>
-          <w:p>
-            <w:r>
-              <w:rPr>
-                <w:b/>
-                <w:color w:val="FFFFFF"/>
-                <w:sz w:val="18"/>
-              </w:rPr>
-              <w:t>授权与记录方式</w:t>
-            </w:r>
-          </w:p>
-        </w:tc>
-      </w:tr>
-      <w:tr>
-        <w:tc>
-          <w:tcPr>
-            <w:tcW w:w="2426" w:type="dxa"/>
-            <w:vAlign w:val="center"/>
-          </w:tcPr>
-          <w:p>
-            <w:r>
-              <w:rPr>
-                <w:sz w:val="18"/>
-              </w:rPr>
-              <w:t>待补充</w:t>
-            </w:r>
-          </w:p>
-        </w:tc>
-        <w:tc>
-          <w:tcPr>
-            <w:tcW w:w="2426" w:type="dxa"/>
-            <w:vAlign w:val="center"/>
-          </w:tcPr>
-          <w:p>
-            <w:r>
-              <w:rPr>
-                <w:sz w:val="18"/>
-              </w:rPr>
-              <w:t>待补充</w:t>
-            </w:r>
-          </w:p>
-        </w:tc>
-        <w:tc>
-          <w:tcPr>
-            <w:tcW w:w="2426" w:type="dxa"/>
-            <w:vAlign w:val="center"/>
-          </w:tcPr>
-          <w:p>
-            <w:r>
-              <w:rPr>
-                <w:sz w:val="18"/>
-              </w:rPr>
-              <w:t>待补充真实访谈内容</w:t>
-            </w:r>
-          </w:p>
-        </w:tc>
-        <w:tc>
-          <w:tcPr>
-            <w:tcW w:w="2426" w:type="dxa"/>
-            <w:vAlign w:val="center"/>
-          </w:tcPr>
-          <w:p>
-            <w:r>
-              <w:rPr>
-                <w:sz w:val="18"/>
-              </w:rPr>
-              <w:t>待补充</w:t>
-            </w:r>
-          </w:p>
-        </w:tc>
-      </w:tr>
-      <w:tr>
-        <w:tc>
-          <w:tcPr>
-            <w:tcW w:w="2426" w:type="dxa"/>
-            <w:vAlign w:val="center"/>
-          </w:tcPr>
-          <w:p>
-            <w:r>
-              <w:rPr>
-                <w:sz w:val="18"/>
-              </w:rPr>
-              <w:t>待补充</w:t>
-            </w:r>
-          </w:p>
-        </w:tc>
-        <w:tc>
-          <w:tcPr>
-            <w:tcW w:w="2426" w:type="dxa"/>
-            <w:vAlign w:val="center"/>
-          </w:tcPr>
-          <w:p>
-            <w:r>
-              <w:rPr>
-                <w:sz w:val="18"/>
-              </w:rPr>
-              <w:t>待补充</w:t>
-            </w:r>
-          </w:p>
-        </w:tc>
-        <w:tc>
-          <w:tcPr>
-            <w:tcW w:w="2426" w:type="dxa"/>
-            <w:vAlign w:val="center"/>
-          </w:tcPr>
-          <w:p>
-            <w:r>
-              <w:rPr>
-                <w:sz w:val="18"/>
-              </w:rPr>
-              <w:t>待补充真实访谈内容</w:t>
-            </w:r>
-          </w:p>
-        </w:tc>
-        <w:tc>
-          <w:tcPr>
-            <w:tcW w:w="2426" w:type="dxa"/>
-            <w:vAlign w:val="center"/>
-          </w:tcPr>
-          <w:p>
-            <w:r>
-              <w:rPr>
-                <w:sz w:val="18"/>
-              </w:rPr>
-              <w:t>待补充</w:t>
-            </w:r>
-          </w:p>
-        </w:tc>
-      </w:tr>
-      <w:tr>
-        <w:tc>
-          <w:tcPr>
-            <w:tcW w:w="2426" w:type="dxa"/>
-            <w:vAlign w:val="center"/>
-          </w:tcPr>
-          <w:p>
-            <w:r>
-              <w:rPr>
-                <w:sz w:val="18"/>
-              </w:rPr>
-              <w:t>待补充</w:t>
-            </w:r>
-          </w:p>
-        </w:tc>
-        <w:tc>
-          <w:tcPr>
-            <w:tcW w:w="2426" w:type="dxa"/>
-            <w:vAlign w:val="center"/>
-          </w:tcPr>
-          <w:p>
-            <w:r>
-              <w:rPr>
-                <w:sz w:val="18"/>
-              </w:rPr>
-              <w:t>待补充</w:t>
-            </w:r>
-          </w:p>
-        </w:tc>
-        <w:tc>
-          <w:tcPr>
-            <w:tcW w:w="2426" w:type="dxa"/>
-            <w:vAlign w:val="center"/>
-          </w:tcPr>
-          <w:p>
-            <w:r>
-              <w:rPr>
-                <w:sz w:val="18"/>
-              </w:rPr>
-              <w:t>待补充真实访谈内容</w:t>
-            </w:r>
-          </w:p>
-        </w:tc>
-        <w:tc>
-          <w:tcPr>
-            <w:tcW w:w="2426" w:type="dxa"/>
-            <w:vAlign w:val="center"/>
-          </w:tcPr>
-          <w:p>
-            <w:r>
-              <w:rPr>
-                <w:sz w:val="18"/>
-              </w:rPr>
-              <w:t>待补充</w:t>
-            </w:r>
-          </w:p>
-        </w:tc>
-      </w:tr>
-    </w:tbl>
-    <w:p>
-      <w:pPr>
-        <w:pStyle w:val="2"/>
-        <w:rPr>
-          <w:lang w:eastAsia="zh-CN"/>
-        </w:rPr>
-      </w:pPr>
-      <w:r>
-        <w:rPr>
-          <w:lang w:eastAsia="zh-CN"/>
-        </w:rPr>
-        <w:lastRenderedPageBreak/>
-        <w:t>附件二：图片与资料来源说明</w:t>
-      </w:r>
-    </w:p>
-    <w:p>
-      <w:pPr>
-        <w:ind w:firstLine="480"/>
-        <w:rPr>
-          <w:lang w:eastAsia="zh-CN"/>
-        </w:rPr>
-      </w:pPr>
-      <w:r>
-        <w:rPr>
-          <w:lang w:eastAsia="zh-CN"/>
-        </w:rPr>
-        <w:t>本报告所用现场图片均来自用户提供的《PDF_20260711_210636.pdf》，图注逐项标明对应页码。第14页</w:t>
-      </w:r>
-      <w:proofErr w:type="gramStart"/>
-      <w:r>
-        <w:rPr>
-          <w:lang w:eastAsia="zh-CN"/>
-        </w:rPr>
-        <w:t>更新前旧照</w:t>
-      </w:r>
-      <w:proofErr w:type="gramEnd"/>
-      <w:r>
-        <w:rPr>
-          <w:lang w:eastAsia="zh-CN"/>
-        </w:rPr>
-        <w:t>及第8、17、33页组合图片未作为本次现场证据。课程结构依据《2026年春季学期〈走在前列的广东实践〉课程实践教学任务安排》。文件夹中的《2010年的永庆坊，你还认得吗？》仅作为历史背景线索，不将其中网络评论视为访谈或事实结论。</w:t>
-      </w:r>
-    </w:p>
-    <w:p>
-      <w:pPr>
-        <w:pStyle w:val="2"/>
-      </w:pPr>
-      <w:proofErr w:type="spellStart"/>
-      <w:r>
-        <w:t>附件三：成员与分工</w:t>
-      </w:r>
-      <w:proofErr w:type="spellEnd"/>
-    </w:p>
-    <w:tbl>
-      <w:tblPr>
-        <w:tblW w:w="0" w:type="auto"/>
-        <w:tblLayout w:type="fixed"/>
-        <w:tblLook w:val="04A0" w:firstRow="1" w:lastRow="0" w:firstColumn="1" w:lastColumn="0" w:noHBand="0" w:noVBand="1"/>
-      </w:tblPr>
-      <w:tblGrid>
-        <w:gridCol w:w="3235"/>
-        <w:gridCol w:w="3235"/>
-        <w:gridCol w:w="3235"/>
-      </w:tblGrid>
-      <w:tr>
-        <w:tc>
-          <w:tcPr>
-            <w:tcW w:w="3235" w:type="dxa"/>
-            <w:shd w:val="clear" w:color="auto" w:fill="172B78"/>
-          </w:tcPr>
-          <w:p>
-            <w:r>
-              <w:rPr>
-                <w:b/>
-                <w:color w:val="FFFFFF"/>
-              </w:rPr>
-              <w:t>成员</w:t>
-            </w:r>
-          </w:p>
-        </w:tc>
-        <w:tc>
-          <w:tcPr>
-            <w:tcW w:w="3235" w:type="dxa"/>
-            <w:shd w:val="clear" w:color="auto" w:fill="172B78"/>
-          </w:tcPr>
-          <w:p>
-            <w:r>
-              <w:rPr>
-                <w:b/>
-                <w:color w:val="FFFFFF"/>
-              </w:rPr>
-              <w:t>学号</w:t>
-            </w:r>
-          </w:p>
-        </w:tc>
-        <w:tc>
-          <w:tcPr>
-            <w:tcW w:w="3235" w:type="dxa"/>
-            <w:shd w:val="clear" w:color="auto" w:fill="172B78"/>
-          </w:tcPr>
-          <w:p>
-            <w:r>
-              <w:rPr>
-                <w:b/>
-                <w:color w:val="FFFFFF"/>
-              </w:rPr>
-              <w:t>分工</w:t>
-            </w:r>
-          </w:p>
-        </w:tc>
-      </w:tr>
-      <w:tr>
-        <w:tc>
-          <w:tcPr>
-            <w:tcW w:w="3235" w:type="dxa"/>
-          </w:tcPr>
-          <w:p>
-            <w:r>
-              <w:t>待填写</w:t>
-            </w:r>
-          </w:p>
-        </w:tc>
-        <w:tc>
-          <w:tcPr>
-            <w:tcW w:w="3235" w:type="dxa"/>
-          </w:tcPr>
-          <w:p>
-            <w:r>
-              <w:t>待填写</w:t>
-            </w:r>
-          </w:p>
-        </w:tc>
-        <w:tc>
-          <w:tcPr>
-            <w:tcW w:w="3235" w:type="dxa"/>
-          </w:tcPr>
-          <w:p>
-            <w:r>
-              <w:t>待填写</w:t>
-            </w:r>
-          </w:p>
-        </w:tc>
-      </w:tr>
-      <w:tr>
-        <w:tc>
-          <w:tcPr>
-            <w:tcW w:w="3235" w:type="dxa"/>
-          </w:tcPr>
-          <w:p>
-            <w:r>
-              <w:t>待填写</w:t>
-            </w:r>
-          </w:p>
-        </w:tc>
-        <w:tc>
-          <w:tcPr>
-            <w:tcW w:w="3235" w:type="dxa"/>
-          </w:tcPr>
-          <w:p>
-            <w:r>
-              <w:t>待填写</w:t>
-            </w:r>
-          </w:p>
-        </w:tc>
-        <w:tc>
-          <w:tcPr>
-            <w:tcW w:w="3235" w:type="dxa"/>
-          </w:tcPr>
-          <w:p>
-            <w:r>
-              <w:t>待填写</w:t>
-            </w:r>
-          </w:p>
-        </w:tc>
-      </w:tr>
-    </w:tbl>
-    <w:p/>
+        <w:t>通过本次观察，我认识到传统文化保护并不是保存几栋旧建筑，也不是简单增加传统符号，而是让建筑、技艺与社区关系在现代城市中继续发挥作用。永庆坊的骑楼、粤剧空间和滨河景观说明，文化遗产可以通过合理更新重新进入公众生活；商业和数字传播也确实能够提高可见度。但文化价值不能只由“是否适合打卡”衡量，真正可持续的更新还应尊重历史真实性、传承人的劳动和社区日常需求。作为青年学生，我们既要主动了解文化背后的知识，也应在引用图片、访谈和网络资料时保持诚实，以可靠记录参与岭南文化传播。</w:t>
+      </w:r>
+    </w:p>
     <w:sectPr>
-      <w:headerReference w:type="default" r:id="rId15"/>
-      <w:footerReference w:type="default" r:id="rId16"/>
+      <w:headerReference w:type="default" r:id="rId17"/>
+      <w:footerReference w:type="default" r:id="rId18"/>
       <w:pgSz w:w="12240" w:h="15840"/>
       <w:pgMar w:top="1181" w:right="1267" w:bottom="1037" w:left="1267" w:header="680" w:footer="504" w:gutter="0"/>
       <w:pgNumType w:start="1"/>
@@ -2794,6 +3110,270 @@
 <file path=word/numbering.xml><?xml version="1.0" encoding="utf-8"?>
 <w:numbering xmlns:wpc="http://schemas.microsoft.com/office/word/2010/wordprocessingCanvas" xmlns:cx="http://schemas.microsoft.com/office/drawing/2014/chartex" xmlns:cx1="http://schemas.microsoft.com/office/drawing/2015/9/8/chartex" xmlns:cx2="http://schemas.microsoft.com/office/drawing/2015/10/21/chartex" xmlns:cx3="http://schemas.microsoft.com/office/drawing/2016/5/9/chartex" xmlns:cx4="http://schemas.microsoft.com/office/drawing/2016/5/10/chartex" xmlns:cx5="http://schemas.microsoft.com/office/drawing/2016/5/11/chartex" xmlns:cx6="http://schemas.microsoft.com/office/drawing/2016/5/12/chartex" xmlns:cx7="http://schemas.microsoft.com/office/drawing/2016/5/13/chartex" xmlns:cx8="http://schemas.microsoft.com/office/drawing/2016/5/14/chartex" xmlns:mc="http://schemas.openxmlformats.org/markup-compatibility/2006" xmlns:aink="http://schemas.microsoft.com/office/drawing/2016/ink" xmlns:am3d="http://schemas.microsoft.com/office/drawing/2017/model3d" xmlns:o="urn:schemas-microsoft-com:office:office" xmlns:oel="http://schemas.microsoft.com/office/2019/extlst" xmlns:r="http://schemas.openxmlformats.org/officeDocument/2006/relationships" xmlns:m="http://schemas.openxmlformats.org/officeDocument/2006/math" xmlns:v="urn:schemas-microsoft-com:vml" xmlns:wp14="http://schemas.microsoft.com/office/word/2010/wordprocessingDrawing" xmlns:wp="http://schemas.openxmlformats.org/drawingml/2006/wordprocessingDrawing" xmlns:w10="urn:schemas-microsoft-com:office:word" xmlns:w="http://schemas.openxmlformats.org/wordprocessingml/2006/main" xmlns:w14="http://schemas.microsoft.com/office/word/2010/wordml" xmlns:w15="http://schemas.microsoft.com/office/word/2012/wordml" xmlns:w16cex="http://schemas.microsoft.com/office/word/2018/wordml/cex" xmlns:w16cid="http://schemas.microsoft.com/office/word/2016/wordml/cid" xmlns:w16="http://schemas.microsoft.com/office/word/2018/wordml" xmlns:w16du="http://schemas.microsoft.com/office/word/2023/wordml/word16du" xmlns:w16sdtdh="http://schemas.microsoft.com/office/word/2020/wordml/sdtdatahash" xmlns:w16sdtfl="http://schemas.microsoft.com/office/word/2024/wordml/sdtformatlock" xmlns:w16se="http://schemas.microsoft.com/office/word/2015/wordml/symex" xmlns:wpg="http://schemas.microsoft.com/office/word/2010/wordprocessingGroup" xmlns:wpi="http://schemas.microsoft.com/office/word/2010/wordprocessingInk" xmlns:wne="http://schemas.microsoft.com/office/word/2006/wordml" xmlns:wps="http://schemas.microsoft.com/office/word/2010/wordprocessingShape" mc:Ignorable="w14 w15 w16se w16cid w16 w16cex w16sdtdh w16sdtfl w16du wp14">
   <w:abstractNum w:abstractNumId="0" w15:restartNumberingAfterBreak="0">
+    <w:nsid w:val="000D166B"/>
+    <w:multiLevelType w:val="hybridMultilevel"/>
+    <w:tmpl w:val="5E1EF93C"/>
+    <w:lvl w:ilvl="0" w:tplc="0409000F">
+      <w:start w:val="1"/>
+      <w:numFmt w:val="decimal"/>
+      <w:lvlText w:val="%1."/>
+      <w:lvlJc w:val="left"/>
+      <w:pPr>
+        <w:ind w:left="920" w:hanging="440"/>
+      </w:pPr>
+    </w:lvl>
+    <w:lvl w:ilvl="1" w:tplc="04090019" w:tentative="1">
+      <w:start w:val="1"/>
+      <w:numFmt w:val="lowerLetter"/>
+      <w:lvlText w:val="%2)"/>
+      <w:lvlJc w:val="left"/>
+      <w:pPr>
+        <w:ind w:left="1360" w:hanging="440"/>
+      </w:pPr>
+    </w:lvl>
+    <w:lvl w:ilvl="2" w:tplc="0409001B" w:tentative="1">
+      <w:start w:val="1"/>
+      <w:numFmt w:val="lowerRoman"/>
+      <w:lvlText w:val="%3."/>
+      <w:lvlJc w:val="right"/>
+      <w:pPr>
+        <w:ind w:left="1800" w:hanging="440"/>
+      </w:pPr>
+    </w:lvl>
+    <w:lvl w:ilvl="3" w:tplc="0409000F" w:tentative="1">
+      <w:start w:val="1"/>
+      <w:numFmt w:val="decimal"/>
+      <w:lvlText w:val="%4."/>
+      <w:lvlJc w:val="left"/>
+      <w:pPr>
+        <w:ind w:left="2240" w:hanging="440"/>
+      </w:pPr>
+    </w:lvl>
+    <w:lvl w:ilvl="4" w:tplc="04090019" w:tentative="1">
+      <w:start w:val="1"/>
+      <w:numFmt w:val="lowerLetter"/>
+      <w:lvlText w:val="%5)"/>
+      <w:lvlJc w:val="left"/>
+      <w:pPr>
+        <w:ind w:left="2680" w:hanging="440"/>
+      </w:pPr>
+    </w:lvl>
+    <w:lvl w:ilvl="5" w:tplc="0409001B" w:tentative="1">
+      <w:start w:val="1"/>
+      <w:numFmt w:val="lowerRoman"/>
+      <w:lvlText w:val="%6."/>
+      <w:lvlJc w:val="right"/>
+      <w:pPr>
+        <w:ind w:left="3120" w:hanging="440"/>
+      </w:pPr>
+    </w:lvl>
+    <w:lvl w:ilvl="6" w:tplc="0409000F" w:tentative="1">
+      <w:start w:val="1"/>
+      <w:numFmt w:val="decimal"/>
+      <w:lvlText w:val="%7."/>
+      <w:lvlJc w:val="left"/>
+      <w:pPr>
+        <w:ind w:left="3560" w:hanging="440"/>
+      </w:pPr>
+    </w:lvl>
+    <w:lvl w:ilvl="7" w:tplc="04090019" w:tentative="1">
+      <w:start w:val="1"/>
+      <w:numFmt w:val="lowerLetter"/>
+      <w:lvlText w:val="%8)"/>
+      <w:lvlJc w:val="left"/>
+      <w:pPr>
+        <w:ind w:left="4000" w:hanging="440"/>
+      </w:pPr>
+    </w:lvl>
+    <w:lvl w:ilvl="8" w:tplc="0409001B" w:tentative="1">
+      <w:start w:val="1"/>
+      <w:numFmt w:val="lowerRoman"/>
+      <w:lvlText w:val="%9."/>
+      <w:lvlJc w:val="right"/>
+      <w:pPr>
+        <w:ind w:left="4440" w:hanging="440"/>
+      </w:pPr>
+    </w:lvl>
+  </w:abstractNum>
+  <w:abstractNum w:abstractNumId="1" w15:restartNumberingAfterBreak="0">
+    <w:nsid w:val="41CC5F6E"/>
+    <w:multiLevelType w:val="hybridMultilevel"/>
+    <w:tmpl w:val="38FC7CC2"/>
+    <w:lvl w:ilvl="0" w:tplc="71926850">
+      <w:start w:val="1"/>
+      <w:numFmt w:val="japaneseCounting"/>
+      <w:lvlText w:val="第%1，"/>
+      <w:lvlJc w:val="left"/>
+      <w:pPr>
+        <w:ind w:left="1200" w:hanging="720"/>
+      </w:pPr>
+      <w:rPr>
+        <w:rFonts w:hint="default"/>
+      </w:rPr>
+    </w:lvl>
+    <w:lvl w:ilvl="1" w:tplc="04090019" w:tentative="1">
+      <w:start w:val="1"/>
+      <w:numFmt w:val="lowerLetter"/>
+      <w:lvlText w:val="%2)"/>
+      <w:lvlJc w:val="left"/>
+      <w:pPr>
+        <w:ind w:left="1360" w:hanging="440"/>
+      </w:pPr>
+    </w:lvl>
+    <w:lvl w:ilvl="2" w:tplc="0409001B" w:tentative="1">
+      <w:start w:val="1"/>
+      <w:numFmt w:val="lowerRoman"/>
+      <w:lvlText w:val="%3."/>
+      <w:lvlJc w:val="right"/>
+      <w:pPr>
+        <w:ind w:left="1800" w:hanging="440"/>
+      </w:pPr>
+    </w:lvl>
+    <w:lvl w:ilvl="3" w:tplc="0409000F" w:tentative="1">
+      <w:start w:val="1"/>
+      <w:numFmt w:val="decimal"/>
+      <w:lvlText w:val="%4."/>
+      <w:lvlJc w:val="left"/>
+      <w:pPr>
+        <w:ind w:left="2240" w:hanging="440"/>
+      </w:pPr>
+    </w:lvl>
+    <w:lvl w:ilvl="4" w:tplc="04090019" w:tentative="1">
+      <w:start w:val="1"/>
+      <w:numFmt w:val="lowerLetter"/>
+      <w:lvlText w:val="%5)"/>
+      <w:lvlJc w:val="left"/>
+      <w:pPr>
+        <w:ind w:left="2680" w:hanging="440"/>
+      </w:pPr>
+    </w:lvl>
+    <w:lvl w:ilvl="5" w:tplc="0409001B" w:tentative="1">
+      <w:start w:val="1"/>
+      <w:numFmt w:val="lowerRoman"/>
+      <w:lvlText w:val="%6."/>
+      <w:lvlJc w:val="right"/>
+      <w:pPr>
+        <w:ind w:left="3120" w:hanging="440"/>
+      </w:pPr>
+    </w:lvl>
+    <w:lvl w:ilvl="6" w:tplc="0409000F" w:tentative="1">
+      <w:start w:val="1"/>
+      <w:numFmt w:val="decimal"/>
+      <w:lvlText w:val="%7."/>
+      <w:lvlJc w:val="left"/>
+      <w:pPr>
+        <w:ind w:left="3560" w:hanging="440"/>
+      </w:pPr>
+    </w:lvl>
+    <w:lvl w:ilvl="7" w:tplc="04090019" w:tentative="1">
+      <w:start w:val="1"/>
+      <w:numFmt w:val="lowerLetter"/>
+      <w:lvlText w:val="%8)"/>
+      <w:lvlJc w:val="left"/>
+      <w:pPr>
+        <w:ind w:left="4000" w:hanging="440"/>
+      </w:pPr>
+    </w:lvl>
+    <w:lvl w:ilvl="8" w:tplc="0409001B" w:tentative="1">
+      <w:start w:val="1"/>
+      <w:numFmt w:val="lowerRoman"/>
+      <w:lvlText w:val="%9."/>
+      <w:lvlJc w:val="right"/>
+      <w:pPr>
+        <w:ind w:left="4440" w:hanging="440"/>
+      </w:pPr>
+    </w:lvl>
+  </w:abstractNum>
+  <w:abstractNum w:abstractNumId="2" w15:restartNumberingAfterBreak="0">
+    <w:nsid w:val="48DF6374"/>
+    <w:multiLevelType w:val="hybridMultilevel"/>
+    <w:tmpl w:val="9D3A6816"/>
+    <w:lvl w:ilvl="0" w:tplc="0409000F">
+      <w:start w:val="1"/>
+      <w:numFmt w:val="decimal"/>
+      <w:lvlText w:val="%1."/>
+      <w:lvlJc w:val="left"/>
+      <w:pPr>
+        <w:ind w:left="920" w:hanging="440"/>
+      </w:pPr>
+      <w:rPr>
+        <w:rFonts w:hint="eastAsia"/>
+      </w:rPr>
+    </w:lvl>
+    <w:lvl w:ilvl="1" w:tplc="04090019" w:tentative="1">
+      <w:start w:val="1"/>
+      <w:numFmt w:val="lowerLetter"/>
+      <w:lvlText w:val="%2)"/>
+      <w:lvlJc w:val="left"/>
+      <w:pPr>
+        <w:ind w:left="1360" w:hanging="440"/>
+      </w:pPr>
+    </w:lvl>
+    <w:lvl w:ilvl="2" w:tplc="0409001B" w:tentative="1">
+      <w:start w:val="1"/>
+      <w:numFmt w:val="lowerRoman"/>
+      <w:lvlText w:val="%3."/>
+      <w:lvlJc w:val="right"/>
+      <w:pPr>
+        <w:ind w:left="1800" w:hanging="440"/>
+      </w:pPr>
+    </w:lvl>
+    <w:lvl w:ilvl="3" w:tplc="0409000F" w:tentative="1">
+      <w:start w:val="1"/>
+      <w:numFmt w:val="decimal"/>
+      <w:lvlText w:val="%4."/>
+      <w:lvlJc w:val="left"/>
+      <w:pPr>
+        <w:ind w:left="2240" w:hanging="440"/>
+      </w:pPr>
+    </w:lvl>
+    <w:lvl w:ilvl="4" w:tplc="04090019" w:tentative="1">
+      <w:start w:val="1"/>
+      <w:numFmt w:val="lowerLetter"/>
+      <w:lvlText w:val="%5)"/>
+      <w:lvlJc w:val="left"/>
+      <w:pPr>
+        <w:ind w:left="2680" w:hanging="440"/>
+      </w:pPr>
+    </w:lvl>
+    <w:lvl w:ilvl="5" w:tplc="0409001B" w:tentative="1">
+      <w:start w:val="1"/>
+      <w:numFmt w:val="lowerRoman"/>
+      <w:lvlText w:val="%6."/>
+      <w:lvlJc w:val="right"/>
+      <w:pPr>
+        <w:ind w:left="3120" w:hanging="440"/>
+      </w:pPr>
+    </w:lvl>
+    <w:lvl w:ilvl="6" w:tplc="0409000F" w:tentative="1">
+      <w:start w:val="1"/>
+      <w:numFmt w:val="decimal"/>
+      <w:lvlText w:val="%7."/>
+      <w:lvlJc w:val="left"/>
+      <w:pPr>
+        <w:ind w:left="3560" w:hanging="440"/>
+      </w:pPr>
+    </w:lvl>
+    <w:lvl w:ilvl="7" w:tplc="04090019" w:tentative="1">
+      <w:start w:val="1"/>
+      <w:numFmt w:val="lowerLetter"/>
+      <w:lvlText w:val="%8)"/>
+      <w:lvlJc w:val="left"/>
+      <w:pPr>
+        <w:ind w:left="4000" w:hanging="440"/>
+      </w:pPr>
+    </w:lvl>
+    <w:lvl w:ilvl="8" w:tplc="0409001B" w:tentative="1">
+      <w:start w:val="1"/>
+      <w:numFmt w:val="lowerRoman"/>
+      <w:lvlText w:val="%9."/>
+      <w:lvlJc w:val="right"/>
+      <w:pPr>
+        <w:ind w:left="4440" w:hanging="440"/>
+      </w:pPr>
+    </w:lvl>
+  </w:abstractNum>
+  <w:abstractNum w:abstractNumId="3" w15:restartNumberingAfterBreak="0">
     <w:nsid w:val="57D01B79"/>
     <w:multiLevelType w:val="multilevel"/>
     <w:tmpl w:val="66202F6A"/>
@@ -2879,7 +3459,93 @@
       </w:pPr>
     </w:lvl>
   </w:abstractNum>
-  <w:abstractNum w:abstractNumId="1" w15:restartNumberingAfterBreak="0">
+  <w:abstractNum w:abstractNumId="4" w15:restartNumberingAfterBreak="0">
+    <w:nsid w:val="5E360484"/>
+    <w:multiLevelType w:val="hybridMultilevel"/>
+    <w:tmpl w:val="F454CF3E"/>
+    <w:lvl w:ilvl="0" w:tplc="0409000F">
+      <w:start w:val="1"/>
+      <w:numFmt w:val="decimal"/>
+      <w:lvlText w:val="%1."/>
+      <w:lvlJc w:val="left"/>
+      <w:pPr>
+        <w:ind w:left="920" w:hanging="440"/>
+      </w:pPr>
+    </w:lvl>
+    <w:lvl w:ilvl="1" w:tplc="04090019" w:tentative="1">
+      <w:start w:val="1"/>
+      <w:numFmt w:val="lowerLetter"/>
+      <w:lvlText w:val="%2)"/>
+      <w:lvlJc w:val="left"/>
+      <w:pPr>
+        <w:ind w:left="1360" w:hanging="440"/>
+      </w:pPr>
+    </w:lvl>
+    <w:lvl w:ilvl="2" w:tplc="0409001B" w:tentative="1">
+      <w:start w:val="1"/>
+      <w:numFmt w:val="lowerRoman"/>
+      <w:lvlText w:val="%3."/>
+      <w:lvlJc w:val="right"/>
+      <w:pPr>
+        <w:ind w:left="1800" w:hanging="440"/>
+      </w:pPr>
+    </w:lvl>
+    <w:lvl w:ilvl="3" w:tplc="0409000F" w:tentative="1">
+      <w:start w:val="1"/>
+      <w:numFmt w:val="decimal"/>
+      <w:lvlText w:val="%4."/>
+      <w:lvlJc w:val="left"/>
+      <w:pPr>
+        <w:ind w:left="2240" w:hanging="440"/>
+      </w:pPr>
+    </w:lvl>
+    <w:lvl w:ilvl="4" w:tplc="04090019" w:tentative="1">
+      <w:start w:val="1"/>
+      <w:numFmt w:val="lowerLetter"/>
+      <w:lvlText w:val="%5)"/>
+      <w:lvlJc w:val="left"/>
+      <w:pPr>
+        <w:ind w:left="2680" w:hanging="440"/>
+      </w:pPr>
+    </w:lvl>
+    <w:lvl w:ilvl="5" w:tplc="0409001B" w:tentative="1">
+      <w:start w:val="1"/>
+      <w:numFmt w:val="lowerRoman"/>
+      <w:lvlText w:val="%6."/>
+      <w:lvlJc w:val="right"/>
+      <w:pPr>
+        <w:ind w:left="3120" w:hanging="440"/>
+      </w:pPr>
+    </w:lvl>
+    <w:lvl w:ilvl="6" w:tplc="0409000F" w:tentative="1">
+      <w:start w:val="1"/>
+      <w:numFmt w:val="decimal"/>
+      <w:lvlText w:val="%7."/>
+      <w:lvlJc w:val="left"/>
+      <w:pPr>
+        <w:ind w:left="3560" w:hanging="440"/>
+      </w:pPr>
+    </w:lvl>
+    <w:lvl w:ilvl="7" w:tplc="04090019" w:tentative="1">
+      <w:start w:val="1"/>
+      <w:numFmt w:val="lowerLetter"/>
+      <w:lvlText w:val="%8)"/>
+      <w:lvlJc w:val="left"/>
+      <w:pPr>
+        <w:ind w:left="4000" w:hanging="440"/>
+      </w:pPr>
+    </w:lvl>
+    <w:lvl w:ilvl="8" w:tplc="0409001B" w:tentative="1">
+      <w:start w:val="1"/>
+      <w:numFmt w:val="lowerRoman"/>
+      <w:lvlText w:val="%9."/>
+      <w:lvlJc w:val="right"/>
+      <w:pPr>
+        <w:ind w:left="4440" w:hanging="440"/>
+      </w:pPr>
+    </w:lvl>
+  </w:abstractNum>
+  <w:abstractNum w:abstractNumId="5" w15:restartNumberingAfterBreak="0">
     <w:nsid w:val="6A8E1372"/>
     <w:multiLevelType w:val="multilevel"/>
     <w:tmpl w:val="CAB63DA0"/>
@@ -2966,10 +3632,22 @@
     </w:lvl>
   </w:abstractNum>
   <w:num w:numId="1" w16cid:durableId="760104273">
+    <w:abstractNumId w:val="5"/>
+  </w:num>
+  <w:num w:numId="2" w16cid:durableId="562562021">
+    <w:abstractNumId w:val="3"/>
+  </w:num>
+  <w:num w:numId="3" w16cid:durableId="220944074">
+    <w:abstractNumId w:val="2"/>
+  </w:num>
+  <w:num w:numId="4" w16cid:durableId="1131172994">
     <w:abstractNumId w:val="1"/>
   </w:num>
-  <w:num w:numId="2" w16cid:durableId="562562021">
+  <w:num w:numId="5" w16cid:durableId="367876875">
     <w:abstractNumId w:val="0"/>
+  </w:num>
+  <w:num w:numId="6" w16cid:durableId="501315400">
+    <w:abstractNumId w:val="4"/>
   </w:num>
 </w:numbering>
 </file>
@@ -3737,6 +4415,16 @@
       <w:szCs w:val="18"/>
     </w:rPr>
   </w:style>
+  <w:style w:type="paragraph" w:styleId="af">
+    <w:name w:val="List Paragraph"/>
+    <w:basedOn w:val="a"/>
+    <w:uiPriority w:val="34"/>
+    <w:qFormat/>
+    <w:rsid w:val="00B9604D"/>
+    <w:pPr>
+      <w:ind w:firstLineChars="200" w:firstLine="420"/>
+    </w:pPr>
+  </w:style>
 </w:styles>
 </file>
 

</xml_diff>